<commit_message>
feat: add report identification and party data to Word
</commit_message>
<xml_diff>
--- a/templates/modelo_relatorio.docx
+++ b/templates/modelo_relatorio.docx
@@ -4,15 +4,55 @@
   <w:body>
     <w:p>
       <w:pPr>
-        <w:pStyle w:val="Title"/>
+        <w:pStyle w:val="Heading1"/>
       </w:pPr>
       <w:r>
-        <w:t>{{ title }}</w:t>
+        <w:t>DADOS DA VISTORIA</w:t>
+      </w:r>
+    </w:p>
+    <w:p>
+      <w:r>
+        <w:t>{%p if report_type %}</w:t>
       </w:r>
     </w:p>
     <w:p>
       <w:r>
         <w:t>Tipo da vistoria: {{ report_type }}</w:t>
+      </w:r>
+    </w:p>
+    <w:p>
+      <w:r>
+        <w:t>{%p endif %}</w:t>
+      </w:r>
+    </w:p>
+    <w:p>
+      <w:r>
+        <w:t>{%p if title %}</w:t>
+      </w:r>
+    </w:p>
+    <w:p>
+      <w:r>
+        <w:t>Título: {{ title }}</w:t>
+      </w:r>
+    </w:p>
+    <w:p>
+      <w:r>
+        <w:t>{%p endif %}</w:t>
+      </w:r>
+    </w:p>
+    <w:p>
+      <w:r>
+        <w:t>{%p if code %}</w:t>
+      </w:r>
+    </w:p>
+    <w:p>
+      <w:r>
+        <w:t>Código / referência: {{ code }}</w:t>
+      </w:r>
+    </w:p>
+    <w:p>
+      <w:r>
+        <w:t>{%p endif %}</w:t>
       </w:r>
     </w:p>
     <w:p>
@@ -32,7 +72,349 @@
     </w:p>
     <w:p>
       <w:r>
+        <w:t>{%p if issue_date %}</w:t>
+      </w:r>
+    </w:p>
+    <w:p>
+      <w:r>
+        <w:t>Data de emissão: {{ issue_date }}</w:t>
+      </w:r>
+    </w:p>
+    <w:p>
+      <w:r>
+        <w:t>{%p endif %}</w:t>
+      </w:r>
+    </w:p>
+    <w:p>
+      <w:r>
+        <w:t>{%p if inspector_name %}</w:t>
+      </w:r>
+    </w:p>
+    <w:p>
+      <w:r>
         <w:t>Responsável pela vistoria: {{ inspector_name }}</w:t>
+      </w:r>
+    </w:p>
+    <w:p>
+      <w:r>
+        <w:t>{%p endif %}</w:t>
+      </w:r>
+    </w:p>
+    <w:p>
+      <w:pPr>
+        <w:pStyle w:val="Heading1"/>
+      </w:pPr>
+      <w:r>
+        <w:t>DADOS DO IMÓVEL</w:t>
+      </w:r>
+    </w:p>
+    <w:p>
+      <w:r>
+        <w:t>{%p if property.property_type %}</w:t>
+      </w:r>
+    </w:p>
+    <w:p>
+      <w:r>
+        <w:t>Tipo do imóvel: {{ property.property_type }}</w:t>
+      </w:r>
+    </w:p>
+    <w:p>
+      <w:r>
+        <w:t>{%p endif %}</w:t>
+      </w:r>
+    </w:p>
+    <w:p>
+      <w:r>
+        <w:t>{%p if property.description %}</w:t>
+      </w:r>
+    </w:p>
+    <w:p>
+      <w:r>
+        <w:t>Descrição resumida: {{ property.description }}</w:t>
+      </w:r>
+    </w:p>
+    <w:p>
+      <w:r>
+        <w:t>{%p endif %}</w:t>
+      </w:r>
+    </w:p>
+    <w:p>
+      <w:r>
+        <w:t>{%p if property.address %}</w:t>
+      </w:r>
+    </w:p>
+    <w:p>
+      <w:r>
+        <w:t>Endereço: {{ property.address }}</w:t>
+      </w:r>
+    </w:p>
+    <w:p>
+      <w:r>
+        <w:t>{%p endif %}</w:t>
+      </w:r>
+    </w:p>
+    <w:p>
+      <w:r>
+        <w:t>{%p if property.number %}</w:t>
+      </w:r>
+    </w:p>
+    <w:p>
+      <w:r>
+        <w:t>Número: {{ property.number }}</w:t>
+      </w:r>
+    </w:p>
+    <w:p>
+      <w:r>
+        <w:t>{%p endif %}</w:t>
+      </w:r>
+    </w:p>
+    <w:p>
+      <w:r>
+        <w:t>{%p if property.complement %}</w:t>
+      </w:r>
+    </w:p>
+    <w:p>
+      <w:r>
+        <w:t>Complemento: {{ property.complement }}</w:t>
+      </w:r>
+    </w:p>
+    <w:p>
+      <w:r>
+        <w:t>{%p endif %}</w:t>
+      </w:r>
+    </w:p>
+    <w:p>
+      <w:r>
+        <w:t>{%p if property.neighborhood %}</w:t>
+      </w:r>
+    </w:p>
+    <w:p>
+      <w:r>
+        <w:t>Bairro: {{ property.neighborhood }}</w:t>
+      </w:r>
+    </w:p>
+    <w:p>
+      <w:r>
+        <w:t>{%p endif %}</w:t>
+      </w:r>
+    </w:p>
+    <w:p>
+      <w:r>
+        <w:t>{%p if property.city %}</w:t>
+      </w:r>
+    </w:p>
+    <w:p>
+      <w:r>
+        <w:t>Cidade: {{ property.city }}</w:t>
+      </w:r>
+    </w:p>
+    <w:p>
+      <w:r>
+        <w:t>{%p endif %}</w:t>
+      </w:r>
+    </w:p>
+    <w:p>
+      <w:r>
+        <w:t>{%p if property.state %}</w:t>
+      </w:r>
+    </w:p>
+    <w:p>
+      <w:r>
+        <w:t>Estado: {{ property.state }}</w:t>
+      </w:r>
+    </w:p>
+    <w:p>
+      <w:r>
+        <w:t>{%p endif %}</w:t>
+      </w:r>
+    </w:p>
+    <w:p>
+      <w:r>
+        <w:t>{%p if property.postal_code %}</w:t>
+      </w:r>
+    </w:p>
+    <w:p>
+      <w:r>
+        <w:t>CEP: {{ property.postal_code }}</w:t>
+      </w:r>
+    </w:p>
+    <w:p>
+      <w:r>
+        <w:t>{%p endif %}</w:t>
+      </w:r>
+    </w:p>
+    <w:p>
+      <w:pPr>
+        <w:pStyle w:val="Heading1"/>
+      </w:pPr>
+      <w:r>
+        <w:t>PARTES ENVOLVIDAS</w:t>
+      </w:r>
+    </w:p>
+    <w:p>
+      <w:pPr>
+        <w:pStyle w:val="Heading2"/>
+      </w:pPr>
+      <w:r>
+        <w:t>LOCADOR</w:t>
+      </w:r>
+    </w:p>
+    <w:p>
+      <w:r>
+        <w:t>{%p if landlord.name %}</w:t>
+      </w:r>
+    </w:p>
+    <w:p>
+      <w:r>
+        <w:t>Nome: {{ landlord.name }}</w:t>
+      </w:r>
+    </w:p>
+    <w:p>
+      <w:r>
+        <w:t>{%p endif %}</w:t>
+      </w:r>
+    </w:p>
+    <w:p>
+      <w:r>
+        <w:t>{%p if landlord.document %}</w:t>
+      </w:r>
+    </w:p>
+    <w:p>
+      <w:r>
+        <w:t>CPF / CNPJ: {{ landlord.document }}</w:t>
+      </w:r>
+    </w:p>
+    <w:p>
+      <w:r>
+        <w:t>{%p endif %}</w:t>
+      </w:r>
+    </w:p>
+    <w:p>
+      <w:r>
+        <w:t>{%p if landlord.phone %}</w:t>
+      </w:r>
+    </w:p>
+    <w:p>
+      <w:r>
+        <w:t>Telefone: {{ landlord.phone }}</w:t>
+      </w:r>
+    </w:p>
+    <w:p>
+      <w:r>
+        <w:t>{%p endif %}</w:t>
+      </w:r>
+    </w:p>
+    <w:p>
+      <w:r>
+        <w:t>{%p if landlord.email %}</w:t>
+      </w:r>
+    </w:p>
+    <w:p>
+      <w:r>
+        <w:t>E-mail: {{ landlord.email }}</w:t>
+      </w:r>
+    </w:p>
+    <w:p>
+      <w:r>
+        <w:t>{%p endif %}</w:t>
+      </w:r>
+    </w:p>
+    <w:p>
+      <w:r>
+        <w:t>{%p if landlord.address %}</w:t>
+      </w:r>
+    </w:p>
+    <w:p>
+      <w:r>
+        <w:t>Endereço: {{ landlord.address }}</w:t>
+      </w:r>
+    </w:p>
+    <w:p>
+      <w:r>
+        <w:t>{%p endif %}</w:t>
+      </w:r>
+    </w:p>
+    <w:p>
+      <w:pPr>
+        <w:pStyle w:val="Heading2"/>
+      </w:pPr>
+      <w:r>
+        <w:t>LOCATÁRIO</w:t>
+      </w:r>
+    </w:p>
+    <w:p>
+      <w:r>
+        <w:t>{%p if tenant.name %}</w:t>
+      </w:r>
+    </w:p>
+    <w:p>
+      <w:r>
+        <w:t>Nome: {{ tenant.name }}</w:t>
+      </w:r>
+    </w:p>
+    <w:p>
+      <w:r>
+        <w:t>{%p endif %}</w:t>
+      </w:r>
+    </w:p>
+    <w:p>
+      <w:r>
+        <w:t>{%p if tenant.document %}</w:t>
+      </w:r>
+    </w:p>
+    <w:p>
+      <w:r>
+        <w:t>CPF / CNPJ: {{ tenant.document }}</w:t>
+      </w:r>
+    </w:p>
+    <w:p>
+      <w:r>
+        <w:t>{%p endif %}</w:t>
+      </w:r>
+    </w:p>
+    <w:p>
+      <w:r>
+        <w:t>{%p if tenant.phone %}</w:t>
+      </w:r>
+    </w:p>
+    <w:p>
+      <w:r>
+        <w:t>Telefone: {{ tenant.phone }}</w:t>
+      </w:r>
+    </w:p>
+    <w:p>
+      <w:r>
+        <w:t>{%p endif %}</w:t>
+      </w:r>
+    </w:p>
+    <w:p>
+      <w:r>
+        <w:t>{%p if tenant.email %}</w:t>
+      </w:r>
+    </w:p>
+    <w:p>
+      <w:r>
+        <w:t>E-mail: {{ tenant.email }}</w:t>
+      </w:r>
+    </w:p>
+    <w:p>
+      <w:r>
+        <w:t>{%p endif %}</w:t>
+      </w:r>
+    </w:p>
+    <w:p>
+      <w:r>
+        <w:t>{%p if tenant.address %}</w:t>
+      </w:r>
+    </w:p>
+    <w:p>
+      <w:r>
+        <w:t>Endereço: {{ tenant.address }}</w:t>
+      </w:r>
+    </w:p>
+    <w:p>
+      <w:r>
+        <w:t>{%p endif %}</w:t>
       </w:r>
     </w:p>
     <w:sectPr>

</xml_diff>

<commit_message>
feat: add inspection sections to Word report
</commit_message>
<xml_diff>
--- a/templates/modelo_relatorio.docx
+++ b/templates/modelo_relatorio.docx
@@ -417,6 +417,78 @@
         <w:t>{%p endif %}</w:t>
       </w:r>
     </w:p>
+    <w:p>
+      <w:pPr>
+        <w:pStyle w:val="Heading1"/>
+      </w:pPr>
+      <w:r>
+        <w:t>4. VISTORIA DOS AMBIENTES</w:t>
+      </w:r>
+    </w:p>
+    <w:p>
+      <w:r>
+        <w:t>{%p for section in sections %}</w:t>
+      </w:r>
+    </w:p>
+    <w:p>
+      <w:pPr>
+        <w:pStyle w:val="Heading2"/>
+      </w:pPr>
+      <w:r>
+        <w:t>4.{{ loop.index }} {{ section.name }}</w:t>
+      </w:r>
+    </w:p>
+    <w:p>
+      <w:r>
+        <w:t>{%p if section.description %}</w:t>
+      </w:r>
+    </w:p>
+    <w:p>
+      <w:pPr>
+        <w:pStyle w:val="Heading3"/>
+      </w:pPr>
+      <w:r>
+        <w:t>Descrição</w:t>
+      </w:r>
+    </w:p>
+    <w:p>
+      <w:r>
+        <w:t>{{ section.description }}</w:t>
+      </w:r>
+    </w:p>
+    <w:p>
+      <w:r>
+        <w:t>{%p endif %}</w:t>
+      </w:r>
+    </w:p>
+    <w:p>
+      <w:r>
+        <w:t>{%p if section.notes %}</w:t>
+      </w:r>
+    </w:p>
+    <w:p>
+      <w:pPr>
+        <w:pStyle w:val="Heading3"/>
+      </w:pPr>
+      <w:r>
+        <w:t>Observações</w:t>
+      </w:r>
+    </w:p>
+    <w:p>
+      <w:r>
+        <w:t>{{ section.notes }}</w:t>
+      </w:r>
+    </w:p>
+    <w:p>
+      <w:r>
+        <w:t>{%p endif %}</w:t>
+      </w:r>
+    </w:p>
+    <w:p>
+      <w:r>
+        <w:t>{%p endfor %}</w:t>
+      </w:r>
+    </w:p>
     <w:sectPr>
       <w:pgSz w:w="12240" w:h="15840"/>
       <w:pgMar w:top="1440" w:right="1800" w:bottom="1440" w:left="1800" w:header="720" w:footer="720" w:gutter="0"/>

</xml_diff>

<commit_message>
feat: add photographic records to Word report
</commit_message>
<xml_diff>
--- a/templates/modelo_relatorio.docx
+++ b/templates/modelo_relatorio.docx
@@ -486,6 +486,120 @@
     </w:p>
     <w:p>
       <w:r>
+        <w:t>{%p if section.photo_rows %}</w:t>
+      </w:r>
+    </w:p>
+    <w:p>
+      <w:pPr>
+        <w:pStyle w:val="Heading3"/>
+      </w:pPr>
+      <w:r>
+        <w:t>Registro fotográfico</w:t>
+      </w:r>
+    </w:p>
+    <w:tbl>
+      <w:tblPr>
+        <w:tblW w:type="auto" w:w="0"/>
+        <w:tblLayout w:type="fixed"/>
+        <w:tblLook w:firstColumn="1" w:firstRow="1" w:lastColumn="0" w:lastRow="0" w:noHBand="0" w:noVBand="1" w:val="04A0"/>
+        <w:tblBorders>
+          <w:top w:val="nil"/>
+          <w:left w:val="nil"/>
+          <w:bottom w:val="nil"/>
+          <w:right w:val="nil"/>
+          <w:insideH w:val="nil"/>
+          <w:insideV w:val="nil"/>
+        </w:tblBorders>
+      </w:tblPr>
+      <w:tblGrid>
+        <w:gridCol w:w="4252"/>
+        <w:gridCol w:w="4252"/>
+      </w:tblGrid>
+      <w:tr>
+        <w:tc>
+          <w:tcPr>
+            <w:tcW w:type="dxa" w:w="4320"/>
+          </w:tcPr>
+          <w:p>
+            <w:r>
+              <w:t>{%tr for row in section.photo_rows %}</w:t>
+            </w:r>
+          </w:p>
+        </w:tc>
+        <w:tc>
+          <w:tcPr>
+            <w:tcW w:type="dxa" w:w="4320"/>
+          </w:tcPr>
+          <w:p/>
+        </w:tc>
+      </w:tr>
+      <w:tr>
+        <w:trPr>
+          <w:cantSplit/>
+        </w:trPr>
+        <w:tc>
+          <w:tcPr>
+            <w:tcW w:type="dxa" w:w="4320"/>
+          </w:tcPr>
+          <w:p>
+            <w:pPr>
+              <w:keepNext/>
+            </w:pPr>
+            <w:r>
+              <w:t>{% if row[0] %}{{ row[0].image }}{% endif %}</w:t>
+            </w:r>
+          </w:p>
+          <w:p>
+            <w:r>
+              <w:t>{% if row[0] %}Foto {{ "%02d"|format(row[0].number) }}{% if row[0].caption %} — {{ row[0].caption }}{% endif %}{% endif %}</w:t>
+            </w:r>
+          </w:p>
+        </w:tc>
+        <w:tc>
+          <w:tcPr>
+            <w:tcW w:type="dxa" w:w="4320"/>
+          </w:tcPr>
+          <w:p>
+            <w:pPr>
+              <w:keepNext/>
+            </w:pPr>
+            <w:r>
+              <w:t>{% if row[1] %}{{ row[1].image }}{% endif %}</w:t>
+            </w:r>
+          </w:p>
+          <w:p>
+            <w:r>
+              <w:t>{% if row[1] %}Foto {{ "%02d"|format(row[1].number) }}{% if row[1].caption %} — {{ row[1].caption }}{% endif %}{% endif %}</w:t>
+            </w:r>
+          </w:p>
+        </w:tc>
+      </w:tr>
+      <w:tr>
+        <w:tc>
+          <w:tcPr>
+            <w:tcW w:type="dxa" w:w="4320"/>
+          </w:tcPr>
+          <w:p>
+            <w:r>
+              <w:t>{%tr endfor %}</w:t>
+            </w:r>
+          </w:p>
+        </w:tc>
+        <w:tc>
+          <w:tcPr>
+            <w:tcW w:type="dxa" w:w="4320"/>
+          </w:tcPr>
+          <w:p/>
+        </w:tc>
+      </w:tr>
+    </w:tbl>
+    <w:p>
+      <w:r>
+        <w:t>{%p endif %}</w:t>
+      </w:r>
+    </w:p>
+    <w:p>
+      <w:r>
         <w:t>{%p endfor %}</w:t>
       </w:r>
     </w:p>

</xml_diff>

<commit_message>
feat: complete Word report closing sections
</commit_message>
<xml_diff>
--- a/templates/modelo_relatorio.docx
+++ b/templates/modelo_relatorio.docx
@@ -603,6 +603,171 @@
         <w:t>{%p endfor %}</w:t>
       </w:r>
     </w:p>
+    <w:p>
+      <w:r>
+        <w:t>{%p if complementary_information.delivered_keys or complementary_information.energy_meter or complementary_information.consumer_unit or complementary_information.general_notes or complementary_information.issue_location %}</w:t>
+      </w:r>
+    </w:p>
+    <w:p>
+      <w:pPr>
+        <w:pStyle w:val="Heading1"/>
+      </w:pPr>
+      <w:r>
+        <w:t>5. INFORMAÇÕES COMPLEMENTARES</w:t>
+      </w:r>
+    </w:p>
+    <w:p>
+      <w:r>
+        <w:t>{%p if complementary_information.delivered_keys %}</w:t>
+      </w:r>
+    </w:p>
+    <w:p>
+      <w:r>
+        <w:t>Chaves entregues: {{ complementary_information.delivered_keys }}</w:t>
+      </w:r>
+    </w:p>
+    <w:p>
+      <w:r>
+        <w:t>{%p endif %}</w:t>
+      </w:r>
+    </w:p>
+    <w:p>
+      <w:r>
+        <w:t>{%p if complementary_information.energy_meter %}</w:t>
+      </w:r>
+    </w:p>
+    <w:p>
+      <w:r>
+        <w:t>Medidor de energia: {{ complementary_information.energy_meter }}</w:t>
+      </w:r>
+    </w:p>
+    <w:p>
+      <w:r>
+        <w:t>{%p endif %}</w:t>
+      </w:r>
+    </w:p>
+    <w:p>
+      <w:r>
+        <w:t>{%p if complementary_information.consumer_unit %}</w:t>
+      </w:r>
+    </w:p>
+    <w:p>
+      <w:r>
+        <w:t>Unidade consumidora: {{ complementary_information.consumer_unit }}</w:t>
+      </w:r>
+    </w:p>
+    <w:p>
+      <w:r>
+        <w:t>{%p endif %}</w:t>
+      </w:r>
+    </w:p>
+    <w:p>
+      <w:r>
+        <w:t>{%p if complementary_information.general_notes %}</w:t>
+      </w:r>
+    </w:p>
+    <w:p>
+      <w:r>
+        <w:t>Observações gerais: {{ complementary_information.general_notes }}</w:t>
+      </w:r>
+    </w:p>
+    <w:p>
+      <w:r>
+        <w:t>{%p endif %}</w:t>
+      </w:r>
+    </w:p>
+    <w:p>
+      <w:r>
+        <w:t>{%p if complementary_information.issue_location %}</w:t>
+      </w:r>
+    </w:p>
+    <w:p>
+      <w:r>
+        <w:t>Local de emissão: {{ complementary_information.issue_location }}</w:t>
+      </w:r>
+    </w:p>
+    <w:p>
+      <w:r>
+        <w:t>{%p endif %}</w:t>
+      </w:r>
+    </w:p>
+    <w:p>
+      <w:r>
+        <w:t>{%p endif %}</w:t>
+      </w:r>
+    </w:p>
+    <w:p>
+      <w:pPr>
+        <w:pStyle w:val="Heading1"/>
+      </w:pPr>
+      <w:r>
+        <w:t>6. TERMOS FINAIS</w:t>
+      </w:r>
+    </w:p>
+    <w:p>
+      <w:r>
+        <w:t>Este relatório reúne as descrições, observações e registros fotográficos da vistoria do imóvel na data indicada. Seu conteúdo documenta as condições observadas durante a vistoria e deve ser lido em conjunto com os registros de cada ambiente. Eventuais esclarecimentos ou correções podem ser registrados para complementar as informações apresentadas.</w:t>
+      </w:r>
+    </w:p>
+    <w:p>
+      <w:r>
+        <w:t>{%p if issue_date_long %}</w:t>
+      </w:r>
+    </w:p>
+    <w:p>
+      <w:r>
+        <w:t>{% if complementary_information.issue_location %}{{ complementary_information.issue_location }}, {% endif %}{{ issue_date_long }}</w:t>
+      </w:r>
+    </w:p>
+    <w:p>
+      <w:r>
+        <w:t>{%p endif %}</w:t>
+      </w:r>
+    </w:p>
+    <w:p>
+      <w:pPr>
+        <w:pStyle w:val="Heading1"/>
+      </w:pPr>
+      <w:r>
+        <w:t>7. ASSINATURAS</w:t>
+      </w:r>
+    </w:p>
+    <w:p>
+      <w:pPr>
+        <w:pStyle w:val="Heading2"/>
+      </w:pPr>
+      <w:r>
+        <w:t>LOCADOR</w:t>
+      </w:r>
+    </w:p>
+    <w:p>
+      <w:r>
+        <w:t>____________________________________</w:t>
+      </w:r>
+    </w:p>
+    <w:p>
+      <w:r>
+        <w:t>{{ landlord.name }}</w:t>
+      </w:r>
+    </w:p>
+    <w:p>
+      <w:pPr>
+        <w:pStyle w:val="Heading2"/>
+      </w:pPr>
+      <w:r>
+        <w:t>LOCATÁRIO</w:t>
+      </w:r>
+    </w:p>
+    <w:p>
+      <w:r>
+        <w:t>____________________________________</w:t>
+      </w:r>
+    </w:p>
+    <w:p>
+      <w:r>
+        <w:t>{{ tenant.name }}</w:t>
+      </w:r>
+    </w:p>
     <w:sectPr>
       <w:pgSz w:w="12240" w:h="15840"/>
       <w:pgMar w:top="1440" w:right="1800" w:bottom="1440" w:left="1800" w:header="720" w:footer="720" w:gutter="0"/>

</xml_diff>

<commit_message>
feat: finalize Word inspection report
</commit_message>
<xml_diff>
--- a/templates/modelo_relatorio.docx
+++ b/templates/modelo_relatorio.docx
@@ -4,99 +4,477 @@
   <w:body>
     <w:p>
       <w:pPr>
-        <w:pStyle w:val="Heading1"/>
+        <w:keepNext/>
+        <w:keepLines/>
+        <w:spacing w:before="0" w:after="200"/>
+        <w:jc w:val="center"/>
       </w:pPr>
       <w:r>
+        <w:rPr>
+          <w:rFonts w:ascii="Arial" w:hAnsi="Arial"/>
+        </w:rPr>
+        <w:drawing>
+          <wp:inline xmlns:a="http://schemas.openxmlformats.org/drawingml/2006/main" xmlns:pic="http://schemas.openxmlformats.org/drawingml/2006/picture">
+            <wp:extent cx="1584000" cy="1056000"/>
+            <wp:docPr id="1" name="Picture 1"/>
+            <wp:cNvGraphicFramePr>
+              <a:graphicFrameLocks noChangeAspect="1"/>
+            </wp:cNvGraphicFramePr>
+            <a:graphic>
+              <a:graphicData uri="http://schemas.openxmlformats.org/drawingml/2006/picture">
+                <pic:pic>
+                  <pic:nvPicPr>
+                    <pic:cNvPr id="0" name="logo_alger.png"/>
+                    <pic:cNvPicPr/>
+                  </pic:nvPicPr>
+                  <pic:blipFill>
+                    <a:blip r:embed="rId9"/>
+                    <a:stretch>
+                      <a:fillRect/>
+                    </a:stretch>
+                  </pic:blipFill>
+                  <pic:spPr>
+                    <a:xfrm>
+                      <a:off x="0" y="0"/>
+                      <a:ext cx="1584000" cy="1056000"/>
+                    </a:xfrm>
+                    <a:prstGeom prst="rect"/>
+                  </pic:spPr>
+                </pic:pic>
+              </a:graphicData>
+            </a:graphic>
+          </wp:inline>
+        </w:drawing>
+      </w:r>
+    </w:p>
+    <w:p>
+      <w:pPr>
+        <w:pStyle w:val="Heading1"/>
+        <w:keepNext/>
+        <w:keepLines/>
+        <w:spacing w:before="0" w:after="80"/>
+        <w:jc w:val="center"/>
+      </w:pPr>
+      <w:r>
+        <w:rPr>
+          <w:rFonts w:ascii="Arial" w:hAnsi="Arial"/>
+        </w:rPr>
+        <w:t>ALGER IMÓVEIS LTDA</w:t>
+      </w:r>
+    </w:p>
+    <w:p>
+      <w:pPr>
+        <w:keepNext/>
+        <w:keepLines/>
+        <w:spacing w:before="0" w:after="80"/>
+        <w:jc w:val="center"/>
+      </w:pPr>
+      <w:r>
+        <w:rPr>
+          <w:rFonts w:ascii="Arial" w:hAnsi="Arial"/>
+        </w:rPr>
+        <w:t>CRECI Nº 005103/0</w:t>
+      </w:r>
+    </w:p>
+    <w:p>
+      <w:pPr>
+        <w:keepNext/>
+        <w:keepLines/>
+        <w:spacing w:before="80" w:after="20" w:line="240" w:lineRule="auto"/>
+        <w:jc w:val="center"/>
+      </w:pPr>
+      <w:r>
+        <w:rPr>
+          <w:rFonts w:ascii="Arial" w:hAnsi="Arial"/>
+          <w:color w:val="123B70"/>
+          <w:sz w:val="17"/>
+        </w:rPr>
+        <w:t>Rodovia Washington Luiz, nº 18.208, Loja C</w:t>
+      </w:r>
+    </w:p>
+    <w:p>
+      <w:pPr>
+        <w:keepNext/>
+        <w:keepLines/>
+        <w:spacing w:before="0" w:after="20" w:line="240" w:lineRule="auto"/>
+        <w:jc w:val="center"/>
+      </w:pPr>
+      <w:r>
+        <w:rPr>
+          <w:rFonts w:ascii="Arial" w:hAnsi="Arial"/>
+          <w:color w:val="123B70"/>
+          <w:sz w:val="17"/>
+        </w:rPr>
+        <w:t>Santa Cruz da Serra, Duque de Caxias / RJ, Cep: 25.265-008</w:t>
+      </w:r>
+    </w:p>
+    <w:p>
+      <w:pPr>
+        <w:keepNext/>
+        <w:keepLines/>
+        <w:spacing w:before="0" w:after="20" w:line="240" w:lineRule="auto"/>
+        <w:jc w:val="center"/>
+      </w:pPr>
+      <w:r>
+        <w:rPr>
+          <w:rFonts w:ascii="Arial" w:hAnsi="Arial"/>
+          <w:color w:val="123B70"/>
+          <w:sz w:val="17"/>
+        </w:rPr>
+        <w:t>CNPJ 04.960.485/0001-16</w:t>
+      </w:r>
+    </w:p>
+    <w:p>
+      <w:pPr>
+        <w:keepNext/>
+        <w:keepLines/>
+        <w:spacing w:before="80" w:after="20" w:line="240" w:lineRule="auto"/>
+        <w:jc w:val="center"/>
+      </w:pPr>
+      <w:r>
+        <w:rPr>
+          <w:rFonts w:ascii="Arial" w:hAnsi="Arial"/>
+          <w:color w:val="123B70"/>
+          <w:sz w:val="17"/>
+        </w:rPr>
+        <w:t>Telefones:</w:t>
+        <w:br/>
+        <w:t>(21) 97011-1382 | (21) 3658-6951 | (21) 99268-1605</w:t>
+      </w:r>
+    </w:p>
+    <w:p>
+      <w:pPr>
+        <w:keepNext/>
+        <w:keepLines/>
+        <w:spacing w:before="0" w:after="20" w:line="240" w:lineRule="auto"/>
+        <w:jc w:val="center"/>
+      </w:pPr>
+      <w:r>
+        <w:rPr>
+          <w:rFonts w:ascii="Arial" w:hAnsi="Arial"/>
+          <w:color w:val="123B70"/>
+          <w:sz w:val="17"/>
+        </w:rPr>
+        <w:t>E-mail: algerimoveis@gmail.com.br</w:t>
+      </w:r>
+    </w:p>
+    <w:p>
+      <w:pPr>
+        <w:keepNext/>
+        <w:keepLines/>
+        <w:spacing w:before="0" w:after="20" w:line="240" w:lineRule="auto"/>
+        <w:jc w:val="center"/>
+      </w:pPr>
+      <w:r>
+        <w:rPr>
+          <w:rFonts w:ascii="Arial" w:hAnsi="Arial"/>
+          <w:color w:val="123B70"/>
+          <w:sz w:val="17"/>
+        </w:rPr>
+        <w:t>Site: www.algerimoveis.com.br</w:t>
+      </w:r>
+    </w:p>
+    <w:p>
+      <w:pPr>
+        <w:keepNext/>
+        <w:keepLines/>
+        <w:spacing w:before="0" w:after="20" w:line="240" w:lineRule="auto"/>
+        <w:jc w:val="center"/>
+      </w:pPr>
+      <w:r>
+        <w:rPr>
+          <w:rFonts w:ascii="Arial" w:hAnsi="Arial"/>
+          <w:color w:val="123B70"/>
+          <w:sz w:val="17"/>
+        </w:rPr>
+        <w:t>Facebook: facebook.com/imoveisalger</w:t>
+      </w:r>
+    </w:p>
+    <w:p>
+      <w:pPr>
+        <w:keepNext/>
+        <w:keepLines/>
+        <w:spacing w:before="140" w:after="200"/>
+        <w:jc w:val="center"/>
+      </w:pPr>
+      <w:r>
+        <w:rPr>
+          <w:rFonts w:ascii="Arial" w:hAnsi="Arial"/>
+          <w:i/>
+          <w:color w:val="123B70"/>
+          <w:sz w:val="20"/>
+        </w:rPr>
+        <w:t>Administração e venda de imóveis</w:t>
+      </w:r>
+    </w:p>
+    <w:p>
+      <w:pPr>
+        <w:pStyle w:val="Title"/>
+        <w:keepNext/>
+        <w:keepLines/>
+        <w:spacing w:before="360" w:after="240"/>
+        <w:jc w:val="center"/>
+      </w:pPr>
+      <w:r>
+        <w:rPr>
+          <w:rFonts w:ascii="Arial" w:hAnsi="Arial"/>
+        </w:rPr>
+        <w:t>RELATÓRIO DE VISTORIA</w:t>
+      </w:r>
+    </w:p>
+    <w:p>
+      <w:pPr>
+        <w:pStyle w:val="Heading2"/>
+        <w:keepNext/>
+        <w:keepLines/>
+        <w:spacing w:before="0" w:after="200"/>
+        <w:jc w:val="center"/>
+      </w:pPr>
+      <w:r>
+        <w:rPr>
+          <w:rFonts w:ascii="Arial" w:hAnsi="Arial"/>
+        </w:rPr>
+        <w:t>VISTORIA {{ report_type|upper }}</w:t>
+      </w:r>
+    </w:p>
+    <w:p>
+      <w:pPr>
+        <w:keepNext/>
+        <w:keepLines/>
+        <w:spacing w:before="0" w:after="160"/>
+        <w:jc w:val="center"/>
+      </w:pPr>
+      <w:r>
+        <w:rPr>
+          <w:rFonts w:ascii="Arial" w:hAnsi="Arial"/>
+        </w:rPr>
+        <w:t>{{ property.property_type }}</w:t>
+      </w:r>
+    </w:p>
+    <w:p>
+      <w:pPr>
+        <w:keepNext/>
+        <w:keepLines/>
+        <w:spacing w:before="0" w:after="100"/>
+        <w:jc w:val="center"/>
+      </w:pPr>
+      <w:r>
+        <w:rPr>
+          <w:rFonts w:ascii="Arial" w:hAnsi="Arial"/>
+        </w:rPr>
+        <w:t>{{ property.address }}{% if property.number %}, {{ property.number }}{% endif %}</w:t>
+      </w:r>
+    </w:p>
+    <w:p>
+      <w:pPr>
+        <w:keepNext/>
+        <w:keepLines/>
+        <w:spacing w:before="0" w:after="240"/>
+        <w:jc w:val="center"/>
+      </w:pPr>
+      <w:r>
+        <w:rPr>
+          <w:rFonts w:ascii="Arial" w:hAnsi="Arial"/>
+        </w:rPr>
+        <w:t>{% if property.neighborhood %}{{ property.neighborhood }}{% endif %}{% if property.city %} — {{ property.city }}{% endif %}{% if property.state %}/{{ property.state }}{% endif %}</w:t>
+      </w:r>
+    </w:p>
+    <w:p>
+      <w:pPr>
+        <w:keepNext w:val="0"/>
+        <w:keepLines/>
+        <w:spacing w:before="0" w:after="0"/>
+        <w:jc w:val="center"/>
+        <w:sectPr>
+          <w:headerReference w:type="default" r:id="rId10"/>
+          <w:footerReference w:type="default" r:id="rId11"/>
+          <w:footerReference w:type="first" r:id="rId12"/>
+          <w:pgSz w:w="11906" w:h="16838"/>
+          <w:pgMar w:top="1417" w:right="1134" w:bottom="2835" w:left="1417" w:header="397" w:footer="510" w:gutter="0"/>
+          <w:cols w:space="720"/>
+          <w:vAlign w:val="center"/>
+          <w:titlePg/>
+          <w:docGrid w:linePitch="360"/>
+        </w:sectPr>
+      </w:pPr>
+      <w:r>
+        <w:rPr>
+          <w:rFonts w:ascii="Arial" w:hAnsi="Arial"/>
+        </w:rPr>
+        <w:t>{{ inspection_date }}</w:t>
+      </w:r>
+    </w:p>
+    <w:p>
+      <w:pPr>
+        <w:pStyle w:val="Heading1"/>
+        <w:pageBreakBefore w:val="0"/>
+      </w:pPr>
+      <w:r>
+        <w:rPr>
+          <w:rFonts w:ascii="Arial" w:hAnsi="Arial"/>
+        </w:rPr>
         <w:t>DADOS DA VISTORIA</w:t>
       </w:r>
     </w:p>
     <w:p>
       <w:r>
+        <w:rPr>
+          <w:rFonts w:ascii="Arial" w:hAnsi="Arial"/>
+        </w:rPr>
         <w:t>{%p if report_type %}</w:t>
       </w:r>
     </w:p>
     <w:p>
+      <w:pPr>
+        <w:spacing w:after="40"/>
+      </w:pPr>
       <w:r>
+        <w:rPr>
+          <w:rFonts w:ascii="Arial" w:hAnsi="Arial"/>
+        </w:rPr>
         <w:t>Tipo da vistoria: {{ report_type }}</w:t>
       </w:r>
     </w:p>
     <w:p>
       <w:r>
+        <w:rPr>
+          <w:rFonts w:ascii="Arial" w:hAnsi="Arial"/>
+        </w:rPr>
         <w:t>{%p endif %}</w:t>
       </w:r>
     </w:p>
     <w:p>
       <w:r>
+        <w:rPr>
+          <w:rFonts w:ascii="Arial" w:hAnsi="Arial"/>
+        </w:rPr>
         <w:t>{%p if title %}</w:t>
       </w:r>
     </w:p>
     <w:p>
+      <w:pPr>
+        <w:spacing w:after="40"/>
+      </w:pPr>
       <w:r>
+        <w:rPr>
+          <w:rFonts w:ascii="Arial" w:hAnsi="Arial"/>
+        </w:rPr>
         <w:t>Título: {{ title }}</w:t>
       </w:r>
     </w:p>
     <w:p>
       <w:r>
+        <w:rPr>
+          <w:rFonts w:ascii="Arial" w:hAnsi="Arial"/>
+        </w:rPr>
         <w:t>{%p endif %}</w:t>
       </w:r>
     </w:p>
     <w:p>
       <w:r>
+        <w:rPr>
+          <w:rFonts w:ascii="Arial" w:hAnsi="Arial"/>
+        </w:rPr>
         <w:t>{%p if code %}</w:t>
       </w:r>
     </w:p>
     <w:p>
+      <w:pPr>
+        <w:spacing w:after="40"/>
+      </w:pPr>
       <w:r>
+        <w:rPr>
+          <w:rFonts w:ascii="Arial" w:hAnsi="Arial"/>
+        </w:rPr>
         <w:t>Código / referência: {{ code }}</w:t>
       </w:r>
     </w:p>
     <w:p>
       <w:r>
+        <w:rPr>
+          <w:rFonts w:ascii="Arial" w:hAnsi="Arial"/>
+        </w:rPr>
         <w:t>{%p endif %}</w:t>
       </w:r>
     </w:p>
     <w:p>
       <w:r>
+        <w:rPr>
+          <w:rFonts w:ascii="Arial" w:hAnsi="Arial"/>
+        </w:rPr>
         <w:t>{%p if inspection_date %}</w:t>
       </w:r>
     </w:p>
     <w:p>
+      <w:pPr>
+        <w:spacing w:after="40"/>
+      </w:pPr>
       <w:r>
+        <w:rPr>
+          <w:rFonts w:ascii="Arial" w:hAnsi="Arial"/>
+        </w:rPr>
         <w:t>Data da vistoria: {{ inspection_date }}</w:t>
       </w:r>
     </w:p>
     <w:p>
       <w:r>
+        <w:rPr>
+          <w:rFonts w:ascii="Arial" w:hAnsi="Arial"/>
+        </w:rPr>
         <w:t>{%p endif %}</w:t>
       </w:r>
     </w:p>
     <w:p>
       <w:r>
+        <w:rPr>
+          <w:rFonts w:ascii="Arial" w:hAnsi="Arial"/>
+        </w:rPr>
         <w:t>{%p if issue_date %}</w:t>
       </w:r>
     </w:p>
     <w:p>
+      <w:pPr>
+        <w:spacing w:after="40"/>
+      </w:pPr>
       <w:r>
+        <w:rPr>
+          <w:rFonts w:ascii="Arial" w:hAnsi="Arial"/>
+        </w:rPr>
         <w:t>Data de emissão: {{ issue_date }}</w:t>
       </w:r>
     </w:p>
     <w:p>
       <w:r>
+        <w:rPr>
+          <w:rFonts w:ascii="Arial" w:hAnsi="Arial"/>
+        </w:rPr>
         <w:t>{%p endif %}</w:t>
       </w:r>
     </w:p>
     <w:p>
       <w:r>
+        <w:rPr>
+          <w:rFonts w:ascii="Arial" w:hAnsi="Arial"/>
+        </w:rPr>
         <w:t>{%p if inspector_name %}</w:t>
       </w:r>
     </w:p>
     <w:p>
+      <w:pPr>
+        <w:spacing w:after="40"/>
+      </w:pPr>
       <w:r>
+        <w:rPr>
+          <w:rFonts w:ascii="Arial" w:hAnsi="Arial"/>
+        </w:rPr>
         <w:t>Responsável pela vistoria: {{ inspector_name }}</w:t>
       </w:r>
     </w:p>
     <w:p>
       <w:r>
+        <w:rPr>
+          <w:rFonts w:ascii="Arial" w:hAnsi="Arial"/>
+        </w:rPr>
         <w:t>{%p endif %}</w:t>
       </w:r>
     </w:p>
@@ -105,141 +483,252 @@
         <w:pStyle w:val="Heading1"/>
       </w:pPr>
       <w:r>
+        <w:rPr>
+          <w:rFonts w:ascii="Arial" w:hAnsi="Arial"/>
+        </w:rPr>
         <w:t>DADOS DO IMÓVEL</w:t>
       </w:r>
     </w:p>
     <w:p>
       <w:r>
+        <w:rPr>
+          <w:rFonts w:ascii="Arial" w:hAnsi="Arial"/>
+        </w:rPr>
         <w:t>{%p if property.property_type %}</w:t>
       </w:r>
     </w:p>
     <w:p>
+      <w:pPr>
+        <w:spacing w:after="40"/>
+      </w:pPr>
       <w:r>
+        <w:rPr>
+          <w:rFonts w:ascii="Arial" w:hAnsi="Arial"/>
+        </w:rPr>
         <w:t>Tipo do imóvel: {{ property.property_type }}</w:t>
       </w:r>
     </w:p>
     <w:p>
       <w:r>
+        <w:rPr>
+          <w:rFonts w:ascii="Arial" w:hAnsi="Arial"/>
+        </w:rPr>
         <w:t>{%p endif %}</w:t>
       </w:r>
     </w:p>
     <w:p>
       <w:r>
+        <w:rPr>
+          <w:rFonts w:ascii="Arial" w:hAnsi="Arial"/>
+        </w:rPr>
         <w:t>{%p if property.description %}</w:t>
       </w:r>
     </w:p>
     <w:p>
+      <w:pPr>
+        <w:spacing w:after="40"/>
+      </w:pPr>
       <w:r>
+        <w:rPr>
+          <w:rFonts w:ascii="Arial" w:hAnsi="Arial"/>
+        </w:rPr>
         <w:t>Descrição resumida: {{ property.description }}</w:t>
       </w:r>
     </w:p>
     <w:p>
       <w:r>
+        <w:rPr>
+          <w:rFonts w:ascii="Arial" w:hAnsi="Arial"/>
+        </w:rPr>
         <w:t>{%p endif %}</w:t>
       </w:r>
     </w:p>
     <w:p>
       <w:r>
+        <w:rPr>
+          <w:rFonts w:ascii="Arial" w:hAnsi="Arial"/>
+        </w:rPr>
         <w:t>{%p if property.address %}</w:t>
       </w:r>
     </w:p>
     <w:p>
+      <w:pPr>
+        <w:spacing w:after="40"/>
+      </w:pPr>
       <w:r>
+        <w:rPr>
+          <w:rFonts w:ascii="Arial" w:hAnsi="Arial"/>
+        </w:rPr>
         <w:t>Endereço: {{ property.address }}</w:t>
       </w:r>
     </w:p>
     <w:p>
       <w:r>
+        <w:rPr>
+          <w:rFonts w:ascii="Arial" w:hAnsi="Arial"/>
+        </w:rPr>
         <w:t>{%p endif %}</w:t>
       </w:r>
     </w:p>
     <w:p>
       <w:r>
+        <w:rPr>
+          <w:rFonts w:ascii="Arial" w:hAnsi="Arial"/>
+        </w:rPr>
         <w:t>{%p if property.number %}</w:t>
       </w:r>
     </w:p>
     <w:p>
+      <w:pPr>
+        <w:spacing w:after="40"/>
+      </w:pPr>
       <w:r>
+        <w:rPr>
+          <w:rFonts w:ascii="Arial" w:hAnsi="Arial"/>
+        </w:rPr>
         <w:t>Número: {{ property.number }}</w:t>
       </w:r>
     </w:p>
     <w:p>
       <w:r>
+        <w:rPr>
+          <w:rFonts w:ascii="Arial" w:hAnsi="Arial"/>
+        </w:rPr>
         <w:t>{%p endif %}</w:t>
       </w:r>
     </w:p>
     <w:p>
       <w:r>
+        <w:rPr>
+          <w:rFonts w:ascii="Arial" w:hAnsi="Arial"/>
+        </w:rPr>
         <w:t>{%p if property.complement %}</w:t>
       </w:r>
     </w:p>
     <w:p>
+      <w:pPr>
+        <w:spacing w:after="40"/>
+      </w:pPr>
       <w:r>
+        <w:rPr>
+          <w:rFonts w:ascii="Arial" w:hAnsi="Arial"/>
+        </w:rPr>
         <w:t>Complemento: {{ property.complement }}</w:t>
       </w:r>
     </w:p>
     <w:p>
       <w:r>
+        <w:rPr>
+          <w:rFonts w:ascii="Arial" w:hAnsi="Arial"/>
+        </w:rPr>
         <w:t>{%p endif %}</w:t>
       </w:r>
     </w:p>
     <w:p>
       <w:r>
+        <w:rPr>
+          <w:rFonts w:ascii="Arial" w:hAnsi="Arial"/>
+        </w:rPr>
         <w:t>{%p if property.neighborhood %}</w:t>
       </w:r>
     </w:p>
     <w:p>
+      <w:pPr>
+        <w:spacing w:after="40"/>
+      </w:pPr>
       <w:r>
+        <w:rPr>
+          <w:rFonts w:ascii="Arial" w:hAnsi="Arial"/>
+        </w:rPr>
         <w:t>Bairro: {{ property.neighborhood }}</w:t>
       </w:r>
     </w:p>
     <w:p>
       <w:r>
+        <w:rPr>
+          <w:rFonts w:ascii="Arial" w:hAnsi="Arial"/>
+        </w:rPr>
         <w:t>{%p endif %}</w:t>
       </w:r>
     </w:p>
     <w:p>
       <w:r>
+        <w:rPr>
+          <w:rFonts w:ascii="Arial" w:hAnsi="Arial"/>
+        </w:rPr>
         <w:t>{%p if property.city %}</w:t>
       </w:r>
     </w:p>
     <w:p>
+      <w:pPr>
+        <w:spacing w:after="40"/>
+      </w:pPr>
       <w:r>
+        <w:rPr>
+          <w:rFonts w:ascii="Arial" w:hAnsi="Arial"/>
+        </w:rPr>
         <w:t>Cidade: {{ property.city }}</w:t>
       </w:r>
     </w:p>
     <w:p>
       <w:r>
+        <w:rPr>
+          <w:rFonts w:ascii="Arial" w:hAnsi="Arial"/>
+        </w:rPr>
         <w:t>{%p endif %}</w:t>
       </w:r>
     </w:p>
     <w:p>
       <w:r>
+        <w:rPr>
+          <w:rFonts w:ascii="Arial" w:hAnsi="Arial"/>
+        </w:rPr>
         <w:t>{%p if property.state %}</w:t>
       </w:r>
     </w:p>
     <w:p>
+      <w:pPr>
+        <w:spacing w:after="40"/>
+      </w:pPr>
       <w:r>
+        <w:rPr>
+          <w:rFonts w:ascii="Arial" w:hAnsi="Arial"/>
+        </w:rPr>
         <w:t>Estado: {{ property.state }}</w:t>
       </w:r>
     </w:p>
     <w:p>
       <w:r>
+        <w:rPr>
+          <w:rFonts w:ascii="Arial" w:hAnsi="Arial"/>
+        </w:rPr>
         <w:t>{%p endif %}</w:t>
       </w:r>
     </w:p>
     <w:p>
       <w:r>
+        <w:rPr>
+          <w:rFonts w:ascii="Arial" w:hAnsi="Arial"/>
+        </w:rPr>
         <w:t>{%p if property.postal_code %}</w:t>
       </w:r>
     </w:p>
     <w:p>
+      <w:pPr>
+        <w:spacing w:after="40"/>
+      </w:pPr>
       <w:r>
+        <w:rPr>
+          <w:rFonts w:ascii="Arial" w:hAnsi="Arial"/>
+        </w:rPr>
         <w:t>CEP: {{ property.postal_code }}</w:t>
       </w:r>
     </w:p>
     <w:p>
       <w:r>
+        <w:rPr>
+          <w:rFonts w:ascii="Arial" w:hAnsi="Arial"/>
+        </w:rPr>
         <w:t>{%p endif %}</w:t>
       </w:r>
     </w:p>
@@ -248,6 +737,9 @@
         <w:pStyle w:val="Heading1"/>
       </w:pPr>
       <w:r>
+        <w:rPr>
+          <w:rFonts w:ascii="Arial" w:hAnsi="Arial"/>
+        </w:rPr>
         <w:t>PARTES ENVOLVIDAS</w:t>
       </w:r>
     </w:p>
@@ -256,81 +748,144 @@
         <w:pStyle w:val="Heading2"/>
       </w:pPr>
       <w:r>
+        <w:rPr>
+          <w:rFonts w:ascii="Arial" w:hAnsi="Arial"/>
+        </w:rPr>
         <w:t>LOCADOR</w:t>
       </w:r>
     </w:p>
     <w:p>
       <w:r>
+        <w:rPr>
+          <w:rFonts w:ascii="Arial" w:hAnsi="Arial"/>
+        </w:rPr>
         <w:t>{%p if landlord.name %}</w:t>
       </w:r>
     </w:p>
     <w:p>
+      <w:pPr>
+        <w:spacing w:after="40"/>
+      </w:pPr>
       <w:r>
+        <w:rPr>
+          <w:rFonts w:ascii="Arial" w:hAnsi="Arial"/>
+        </w:rPr>
         <w:t>Nome: {{ landlord.name }}</w:t>
       </w:r>
     </w:p>
     <w:p>
       <w:r>
+        <w:rPr>
+          <w:rFonts w:ascii="Arial" w:hAnsi="Arial"/>
+        </w:rPr>
         <w:t>{%p endif %}</w:t>
       </w:r>
     </w:p>
     <w:p>
       <w:r>
+        <w:rPr>
+          <w:rFonts w:ascii="Arial" w:hAnsi="Arial"/>
+        </w:rPr>
         <w:t>{%p if landlord.document %}</w:t>
       </w:r>
     </w:p>
     <w:p>
+      <w:pPr>
+        <w:spacing w:after="40"/>
+      </w:pPr>
       <w:r>
+        <w:rPr>
+          <w:rFonts w:ascii="Arial" w:hAnsi="Arial"/>
+        </w:rPr>
         <w:t>CPF / CNPJ: {{ landlord.document }}</w:t>
       </w:r>
     </w:p>
     <w:p>
       <w:r>
+        <w:rPr>
+          <w:rFonts w:ascii="Arial" w:hAnsi="Arial"/>
+        </w:rPr>
         <w:t>{%p endif %}</w:t>
       </w:r>
     </w:p>
     <w:p>
       <w:r>
+        <w:rPr>
+          <w:rFonts w:ascii="Arial" w:hAnsi="Arial"/>
+        </w:rPr>
         <w:t>{%p if landlord.phone %}</w:t>
       </w:r>
     </w:p>
     <w:p>
+      <w:pPr>
+        <w:spacing w:after="40"/>
+      </w:pPr>
       <w:r>
+        <w:rPr>
+          <w:rFonts w:ascii="Arial" w:hAnsi="Arial"/>
+        </w:rPr>
         <w:t>Telefone: {{ landlord.phone }}</w:t>
       </w:r>
     </w:p>
     <w:p>
       <w:r>
+        <w:rPr>
+          <w:rFonts w:ascii="Arial" w:hAnsi="Arial"/>
+        </w:rPr>
         <w:t>{%p endif %}</w:t>
       </w:r>
     </w:p>
     <w:p>
       <w:r>
+        <w:rPr>
+          <w:rFonts w:ascii="Arial" w:hAnsi="Arial"/>
+        </w:rPr>
         <w:t>{%p if landlord.email %}</w:t>
       </w:r>
     </w:p>
     <w:p>
+      <w:pPr>
+        <w:spacing w:after="20"/>
+      </w:pPr>
       <w:r>
+        <w:rPr>
+          <w:rFonts w:ascii="Arial" w:hAnsi="Arial"/>
+        </w:rPr>
         <w:t>E-mail: {{ landlord.email }}</w:t>
       </w:r>
     </w:p>
     <w:p>
       <w:r>
+        <w:rPr>
+          <w:rFonts w:ascii="Arial" w:hAnsi="Arial"/>
+        </w:rPr>
         <w:t>{%p endif %}</w:t>
       </w:r>
     </w:p>
     <w:p>
       <w:r>
+        <w:rPr>
+          <w:rFonts w:ascii="Arial" w:hAnsi="Arial"/>
+        </w:rPr>
         <w:t>{%p if landlord.address %}</w:t>
       </w:r>
     </w:p>
     <w:p>
+      <w:pPr>
+        <w:spacing w:after="40"/>
+      </w:pPr>
       <w:r>
+        <w:rPr>
+          <w:rFonts w:ascii="Arial" w:hAnsi="Arial"/>
+        </w:rPr>
         <w:t>Endereço: {{ landlord.address }}</w:t>
       </w:r>
     </w:p>
     <w:p>
       <w:r>
+        <w:rPr>
+          <w:rFonts w:ascii="Arial" w:hAnsi="Arial"/>
+        </w:rPr>
         <w:t>{%p endif %}</w:t>
       </w:r>
     </w:p>
@@ -339,81 +894,144 @@
         <w:pStyle w:val="Heading2"/>
       </w:pPr>
       <w:r>
+        <w:rPr>
+          <w:rFonts w:ascii="Arial" w:hAnsi="Arial"/>
+        </w:rPr>
         <w:t>LOCATÁRIO</w:t>
       </w:r>
     </w:p>
     <w:p>
       <w:r>
+        <w:rPr>
+          <w:rFonts w:ascii="Arial" w:hAnsi="Arial"/>
+        </w:rPr>
         <w:t>{%p if tenant.name %}</w:t>
       </w:r>
     </w:p>
     <w:p>
+      <w:pPr>
+        <w:spacing w:after="40"/>
+      </w:pPr>
       <w:r>
+        <w:rPr>
+          <w:rFonts w:ascii="Arial" w:hAnsi="Arial"/>
+        </w:rPr>
         <w:t>Nome: {{ tenant.name }}</w:t>
       </w:r>
     </w:p>
     <w:p>
       <w:r>
+        <w:rPr>
+          <w:rFonts w:ascii="Arial" w:hAnsi="Arial"/>
+        </w:rPr>
         <w:t>{%p endif %}</w:t>
       </w:r>
     </w:p>
     <w:p>
       <w:r>
+        <w:rPr>
+          <w:rFonts w:ascii="Arial" w:hAnsi="Arial"/>
+        </w:rPr>
         <w:t>{%p if tenant.document %}</w:t>
       </w:r>
     </w:p>
     <w:p>
+      <w:pPr>
+        <w:spacing w:after="40"/>
+      </w:pPr>
       <w:r>
+        <w:rPr>
+          <w:rFonts w:ascii="Arial" w:hAnsi="Arial"/>
+        </w:rPr>
         <w:t>CPF / CNPJ: {{ tenant.document }}</w:t>
       </w:r>
     </w:p>
     <w:p>
       <w:r>
+        <w:rPr>
+          <w:rFonts w:ascii="Arial" w:hAnsi="Arial"/>
+        </w:rPr>
         <w:t>{%p endif %}</w:t>
       </w:r>
     </w:p>
     <w:p>
       <w:r>
+        <w:rPr>
+          <w:rFonts w:ascii="Arial" w:hAnsi="Arial"/>
+        </w:rPr>
         <w:t>{%p if tenant.phone %}</w:t>
       </w:r>
     </w:p>
     <w:p>
+      <w:pPr>
+        <w:spacing w:after="40"/>
+      </w:pPr>
       <w:r>
+        <w:rPr>
+          <w:rFonts w:ascii="Arial" w:hAnsi="Arial"/>
+        </w:rPr>
         <w:t>Telefone: {{ tenant.phone }}</w:t>
       </w:r>
     </w:p>
     <w:p>
       <w:r>
+        <w:rPr>
+          <w:rFonts w:ascii="Arial" w:hAnsi="Arial"/>
+        </w:rPr>
         <w:t>{%p endif %}</w:t>
       </w:r>
     </w:p>
     <w:p>
       <w:r>
+        <w:rPr>
+          <w:rFonts w:ascii="Arial" w:hAnsi="Arial"/>
+        </w:rPr>
         <w:t>{%p if tenant.email %}</w:t>
       </w:r>
     </w:p>
     <w:p>
+      <w:pPr>
+        <w:spacing w:after="20"/>
+      </w:pPr>
       <w:r>
+        <w:rPr>
+          <w:rFonts w:ascii="Arial" w:hAnsi="Arial"/>
+        </w:rPr>
         <w:t>E-mail: {{ tenant.email }}</w:t>
       </w:r>
     </w:p>
     <w:p>
       <w:r>
+        <w:rPr>
+          <w:rFonts w:ascii="Arial" w:hAnsi="Arial"/>
+        </w:rPr>
         <w:t>{%p endif %}</w:t>
       </w:r>
     </w:p>
     <w:p>
       <w:r>
+        <w:rPr>
+          <w:rFonts w:ascii="Arial" w:hAnsi="Arial"/>
+        </w:rPr>
         <w:t>{%p if tenant.address %}</w:t>
       </w:r>
     </w:p>
     <w:p>
+      <w:pPr>
+        <w:spacing w:after="40"/>
+      </w:pPr>
       <w:r>
+        <w:rPr>
+          <w:rFonts w:ascii="Arial" w:hAnsi="Arial"/>
+        </w:rPr>
         <w:t>Endereço: {{ tenant.address }}</w:t>
       </w:r>
     </w:p>
     <w:p>
       <w:r>
+        <w:rPr>
+          <w:rFonts w:ascii="Arial" w:hAnsi="Arial"/>
+        </w:rPr>
         <w:t>{%p endif %}</w:t>
       </w:r>
     </w:p>
@@ -422,11 +1040,17 @@
         <w:pStyle w:val="Heading1"/>
       </w:pPr>
       <w:r>
+        <w:rPr>
+          <w:rFonts w:ascii="Arial" w:hAnsi="Arial"/>
+        </w:rPr>
         <w:t>4. VISTORIA DOS AMBIENTES</w:t>
       </w:r>
     </w:p>
     <w:p>
       <w:r>
+        <w:rPr>
+          <w:rFonts w:ascii="Arial" w:hAnsi="Arial"/>
+        </w:rPr>
         <w:t>{%p for section in sections %}</w:t>
       </w:r>
     </w:p>
@@ -435,11 +1059,17 @@
         <w:pStyle w:val="Heading2"/>
       </w:pPr>
       <w:r>
+        <w:rPr>
+          <w:rFonts w:ascii="Arial" w:hAnsi="Arial"/>
+        </w:rPr>
         <w:t>4.{{ loop.index }} {{ section.name }}</w:t>
       </w:r>
     </w:p>
     <w:p>
       <w:r>
+        <w:rPr>
+          <w:rFonts w:ascii="Arial" w:hAnsi="Arial"/>
+        </w:rPr>
         <w:t>{%p if section.description %}</w:t>
       </w:r>
     </w:p>
@@ -448,21 +1078,33 @@
         <w:pStyle w:val="Heading3"/>
       </w:pPr>
       <w:r>
+        <w:rPr>
+          <w:rFonts w:ascii="Arial" w:hAnsi="Arial"/>
+        </w:rPr>
         <w:t>Descrição</w:t>
       </w:r>
     </w:p>
     <w:p>
       <w:r>
+        <w:rPr>
+          <w:rFonts w:ascii="Arial" w:hAnsi="Arial"/>
+        </w:rPr>
         <w:t>{{ section.description }}</w:t>
       </w:r>
     </w:p>
     <w:p>
       <w:r>
+        <w:rPr>
+          <w:rFonts w:ascii="Arial" w:hAnsi="Arial"/>
+        </w:rPr>
         <w:t>{%p endif %}</w:t>
       </w:r>
     </w:p>
     <w:p>
       <w:r>
+        <w:rPr>
+          <w:rFonts w:ascii="Arial" w:hAnsi="Arial"/>
+        </w:rPr>
         <w:t>{%p if section.notes %}</w:t>
       </w:r>
     </w:p>
@@ -471,21 +1113,33 @@
         <w:pStyle w:val="Heading3"/>
       </w:pPr>
       <w:r>
+        <w:rPr>
+          <w:rFonts w:ascii="Arial" w:hAnsi="Arial"/>
+        </w:rPr>
         <w:t>Observações</w:t>
       </w:r>
     </w:p>
     <w:p>
       <w:r>
+        <w:rPr>
+          <w:rFonts w:ascii="Arial" w:hAnsi="Arial"/>
+        </w:rPr>
         <w:t>{{ section.notes }}</w:t>
       </w:r>
     </w:p>
     <w:p>
       <w:r>
+        <w:rPr>
+          <w:rFonts w:ascii="Arial" w:hAnsi="Arial"/>
+        </w:rPr>
         <w:t>{%p endif %}</w:t>
       </w:r>
     </w:p>
     <w:p>
       <w:r>
+        <w:rPr>
+          <w:rFonts w:ascii="Arial" w:hAnsi="Arial"/>
+        </w:rPr>
         <w:t>{%p if section.photo_rows %}</w:t>
       </w:r>
     </w:p>
@@ -494,6 +1148,9 @@
         <w:pStyle w:val="Heading3"/>
       </w:pPr>
       <w:r>
+        <w:rPr>
+          <w:rFonts w:ascii="Arial" w:hAnsi="Arial"/>
+        </w:rPr>
         <w:t>Registro fotográfico</w:t>
       </w:r>
     </w:p>
@@ -521,6 +1178,9 @@
             <w:tcW w:type="dxa" w:w="4320"/>
           </w:tcPr>
           <w:p>
+            <w:pPr>
+              <w:jc w:val="center"/>
+            </w:pPr>
             <w:r>
               <w:t>{%tr for row in section.photo_rows %}</w:t>
             </w:r>
@@ -530,7 +1190,11 @@
           <w:tcPr>
             <w:tcW w:type="dxa" w:w="4320"/>
           </w:tcPr>
-          <w:p/>
+          <w:p>
+            <w:pPr>
+              <w:jc w:val="center"/>
+            </w:pPr>
+          </w:p>
         </w:tc>
       </w:tr>
       <w:tr>
@@ -544,12 +1208,18 @@
           <w:p>
             <w:pPr>
               <w:keepNext/>
+              <w:jc w:val="center"/>
             </w:pPr>
             <w:r>
               <w:t>{% if row[0] %}{{ row[0].image }}{% endif %}</w:t>
             </w:r>
           </w:p>
           <w:p>
+            <w:pPr>
+              <w:pStyle w:val="Caption"/>
+              <w:spacing w:after="160"/>
+              <w:jc w:val="center"/>
+            </w:pPr>
             <w:r>
               <w:t>{% if row[0] %}Foto {{ "%02d"|format(row[0].number) }}{% if row[0].caption %} — {{ row[0].caption }}{% endif %}{% endif %}</w:t>
             </w:r>
@@ -562,12 +1232,18 @@
           <w:p>
             <w:pPr>
               <w:keepNext/>
+              <w:jc w:val="center"/>
             </w:pPr>
             <w:r>
               <w:t>{% if row[1] %}{{ row[1].image }}{% endif %}</w:t>
             </w:r>
           </w:p>
           <w:p>
+            <w:pPr>
+              <w:pStyle w:val="Caption"/>
+              <w:spacing w:after="160"/>
+              <w:jc w:val="center"/>
+            </w:pPr>
             <w:r>
               <w:t>{% if row[1] %}Foto {{ "%02d"|format(row[1].number) }}{% if row[1].caption %} — {{ row[1].caption }}{% endif %}{% endif %}</w:t>
             </w:r>
@@ -580,6 +1256,9 @@
             <w:tcW w:type="dxa" w:w="4320"/>
           </w:tcPr>
           <w:p>
+            <w:pPr>
+              <w:jc w:val="center"/>
+            </w:pPr>
             <w:r>
               <w:t>{%tr endfor %}</w:t>
             </w:r>
@@ -589,106 +1268,263 @@
           <w:tcPr>
             <w:tcW w:type="dxa" w:w="4320"/>
           </w:tcPr>
-          <w:p/>
+          <w:p>
+            <w:pPr>
+              <w:jc w:val="center"/>
+            </w:pPr>
+          </w:p>
         </w:tc>
       </w:tr>
     </w:tbl>
     <w:p>
       <w:r>
+        <w:rPr>
+          <w:rFonts w:ascii="Arial" w:hAnsi="Arial"/>
+        </w:rPr>
         <w:t>{%p endif %}</w:t>
       </w:r>
     </w:p>
     <w:p>
       <w:r>
+        <w:rPr>
+          <w:rFonts w:ascii="Arial" w:hAnsi="Arial"/>
+        </w:rPr>
         <w:t>{%p endfor %}</w:t>
       </w:r>
     </w:p>
     <w:p>
       <w:r>
-        <w:t>{%p if complementary_information.delivered_keys or complementary_information.energy_meter or complementary_information.consumer_unit or complementary_information.general_notes or complementary_information.issue_location %}</w:t>
+        <w:t>{%p if complementary_information.delivered_keys or (is_initial_inspection and complementary_information.energy_meter) or complementary_information.consumer_unit or complementary_information.general_notes or complementary_information.issue_location %}</w:t>
       </w:r>
     </w:p>
     <w:p>
       <w:pPr>
         <w:pStyle w:val="Heading1"/>
+        <w:spacing w:before="440"/>
       </w:pPr>
       <w:r>
+        <w:rPr>
+          <w:rFonts w:ascii="Arial" w:hAnsi="Arial"/>
+        </w:rPr>
         <w:t>5. INFORMAÇÕES COMPLEMENTARES</w:t>
       </w:r>
     </w:p>
     <w:p>
       <w:r>
+        <w:rPr>
+          <w:rFonts w:ascii="Arial" w:hAnsi="Arial"/>
+        </w:rPr>
         <w:t>{%p if complementary_information.delivered_keys %}</w:t>
       </w:r>
     </w:p>
     <w:p>
+      <w:pPr>
+        <w:spacing w:after="40"/>
+      </w:pPr>
       <w:r>
+        <w:rPr>
+          <w:rFonts w:ascii="Arial" w:hAnsi="Arial"/>
+        </w:rPr>
         <w:t>Chaves entregues: {{ complementary_information.delivered_keys }}</w:t>
       </w:r>
     </w:p>
     <w:p>
       <w:r>
+        <w:rPr>
+          <w:rFonts w:ascii="Arial" w:hAnsi="Arial"/>
+        </w:rPr>
         <w:t>{%p endif %}</w:t>
       </w:r>
     </w:p>
     <w:p>
       <w:r>
-        <w:t>{%p if complementary_information.energy_meter %}</w:t>
+        <w:t>{%p if is_initial_inspection and complementary_information.energy_meter %}</w:t>
       </w:r>
     </w:p>
     <w:p>
+      <w:pPr>
+        <w:spacing w:after="40"/>
+      </w:pPr>
       <w:r>
+        <w:rPr>
+          <w:rFonts w:ascii="Arial" w:hAnsi="Arial"/>
+        </w:rPr>
         <w:t>Medidor de energia: {{ complementary_information.energy_meter }}</w:t>
       </w:r>
     </w:p>
     <w:p>
       <w:r>
+        <w:rPr>
+          <w:rFonts w:ascii="Arial" w:hAnsi="Arial"/>
+        </w:rPr>
         <w:t>{%p endif %}</w:t>
       </w:r>
     </w:p>
     <w:p>
       <w:r>
+        <w:rPr>
+          <w:rFonts w:ascii="Arial" w:hAnsi="Arial"/>
+        </w:rPr>
         <w:t>{%p if complementary_information.consumer_unit %}</w:t>
       </w:r>
     </w:p>
     <w:p>
+      <w:pPr>
+        <w:spacing w:after="40"/>
+      </w:pPr>
       <w:r>
+        <w:rPr>
+          <w:rFonts w:ascii="Arial" w:hAnsi="Arial"/>
+        </w:rPr>
         <w:t>Unidade consumidora: {{ complementary_information.consumer_unit }}</w:t>
       </w:r>
     </w:p>
     <w:p>
       <w:r>
+        <w:rPr>
+          <w:rFonts w:ascii="Arial" w:hAnsi="Arial"/>
+        </w:rPr>
         <w:t>{%p endif %}</w:t>
       </w:r>
     </w:p>
     <w:p>
       <w:r>
+        <w:rPr>
+          <w:rFonts w:ascii="Arial" w:hAnsi="Arial"/>
+        </w:rPr>
         <w:t>{%p if complementary_information.general_notes %}</w:t>
       </w:r>
     </w:p>
     <w:p>
+      <w:pPr>
+        <w:spacing w:after="40"/>
+      </w:pPr>
       <w:r>
+        <w:rPr>
+          <w:rFonts w:ascii="Arial" w:hAnsi="Arial"/>
+        </w:rPr>
         <w:t>Observações gerais: {{ complementary_information.general_notes }}</w:t>
       </w:r>
     </w:p>
     <w:p>
       <w:r>
+        <w:rPr>
+          <w:rFonts w:ascii="Arial" w:hAnsi="Arial"/>
+        </w:rPr>
         <w:t>{%p endif %}</w:t>
       </w:r>
     </w:p>
     <w:p>
       <w:r>
+        <w:rPr>
+          <w:rFonts w:ascii="Arial" w:hAnsi="Arial"/>
+        </w:rPr>
         <w:t>{%p if complementary_information.issue_location %}</w:t>
       </w:r>
     </w:p>
     <w:p>
+      <w:pPr>
+        <w:spacing w:after="40"/>
+      </w:pPr>
       <w:r>
+        <w:rPr>
+          <w:rFonts w:ascii="Arial" w:hAnsi="Arial"/>
+        </w:rPr>
         <w:t>Local de emissão: {{ complementary_information.issue_location }}</w:t>
       </w:r>
     </w:p>
     <w:p>
       <w:r>
+        <w:rPr>
+          <w:rFonts w:ascii="Arial" w:hAnsi="Arial"/>
+        </w:rPr>
         <w:t>{%p endif %}</w:t>
+      </w:r>
+    </w:p>
+    <w:p>
+      <w:r>
+        <w:rPr>
+          <w:rFonts w:ascii="Arial" w:hAnsi="Arial"/>
+        </w:rPr>
+        <w:t>{%p endif %}</w:t>
+      </w:r>
+    </w:p>
+    <w:p>
+      <w:r>
+        <w:t>{%p if is_initial_inspection %}</w:t>
+      </w:r>
+    </w:p>
+    <w:p>
+      <w:pPr>
+        <w:pStyle w:val="Heading1"/>
+        <w:keepNext/>
+        <w:pageBreakBefore w:val="0"/>
+      </w:pPr>
+      <w:r>
+        <w:t>CONDIÇÕES DA VISTORIA INICIAL</w:t>
+      </w:r>
+    </w:p>
+    <w:p>
+      <w:pPr>
+        <w:keepLines/>
+        <w:spacing w:after="140"/>
+      </w:pPr>
+      <w:r>
+        <w:t xml:space="preserve">• O imóvel está sendo entregue com as instalações elétricas e hidráulicas em perfeito funcionamento, apresentando-se em boas condições de higiene, limpeza e conservação, com todos os cômodos e paredes pintados, sendo que portas, portões e acessórios se encontram também em funcionamento correto, devendo o </w:t>
+      </w:r>
+      <w:r>
+        <w:rPr>
+          <w:b/>
+        </w:rPr>
+        <w:t>LOCATÁRIO</w:t>
+      </w:r>
+      <w:r>
+        <w:t xml:space="preserve"> mantê-lo desta forma, salvo as observações descritas acima;</w:t>
+      </w:r>
+    </w:p>
+    <w:p>
+      <w:pPr>
+        <w:keepLines/>
+        <w:spacing w:after="140"/>
+      </w:pPr>
+      <w:r>
+        <w:t xml:space="preserve">• No ato da entrega definitiva das chaves, o </w:t>
+      </w:r>
+      <w:r>
+        <w:rPr>
+          <w:b/>
+        </w:rPr>
+        <w:t>LOCATÁRIO</w:t>
+      </w:r>
+      <w:r>
+        <w:t xml:space="preserve"> restituirá o imóvel locado nas mesmas condições as quais o recebeu, ou seja, pintado ou as instalações elétricas, hidráulicas e acessórios deverão também estar em perfeitas condições de funcionamento, salvo as deteriorações decorrentes do uso normal e habitual do imóvel;</w:t>
+      </w:r>
+    </w:p>
+    <w:p>
+      <w:pPr>
+        <w:keepLines/>
+        <w:spacing w:after="140"/>
+      </w:pPr>
+      <w:r>
+        <w:t xml:space="preserve">• Após a assinatura, o </w:t>
+      </w:r>
+      <w:r>
+        <w:rPr>
+          <w:b/>
+        </w:rPr>
+        <w:t>LOCATÁRIO</w:t>
+      </w:r>
+      <w:r>
+        <w:t xml:space="preserve"> têm um prazo de 10 (dez) dias para apresentar qualquer irregularidade contida neste documento; passado este prazo, o </w:t>
+      </w:r>
+      <w:r>
+        <w:rPr>
+          <w:b/>
+        </w:rPr>
+        <w:t>LOCATÁRIO</w:t>
+      </w:r>
+      <w:r>
+        <w:t xml:space="preserve"> está ciente que não poderá efetuar reclamações posteriores.</w:t>
       </w:r>
     </w:p>
     <w:p>
@@ -699,83 +1535,335 @@
     <w:p>
       <w:pPr>
         <w:pStyle w:val="Heading1"/>
+        <w:keepNext/>
+        <w:pageBreakBefore w:val="0"/>
       </w:pPr>
       <w:r>
+        <w:rPr>
+          <w:rFonts w:ascii="Arial" w:hAnsi="Arial"/>
+        </w:rPr>
         <w:t>6. TERMOS FINAIS</w:t>
       </w:r>
     </w:p>
     <w:p>
+      <w:pPr>
+        <w:keepLines/>
+      </w:pPr>
       <w:r>
+        <w:rPr>
+          <w:rFonts w:ascii="Arial" w:hAnsi="Arial"/>
+        </w:rPr>
         <w:t>Este relatório reúne as descrições, observações e registros fotográficos da vistoria do imóvel na data indicada. Seu conteúdo documenta as condições observadas durante a vistoria e deve ser lido em conjunto com os registros de cada ambiente. Eventuais esclarecimentos ou correções podem ser registrados para complementar as informações apresentadas.</w:t>
       </w:r>
     </w:p>
     <w:p>
       <w:r>
+        <w:rPr>
+          <w:rFonts w:ascii="Arial" w:hAnsi="Arial"/>
+        </w:rPr>
         <w:t>{%p if issue_date_long %}</w:t>
       </w:r>
     </w:p>
     <w:p>
       <w:r>
+        <w:rPr>
+          <w:rFonts w:ascii="Arial" w:hAnsi="Arial"/>
+        </w:rPr>
         <w:t>{% if complementary_information.issue_location %}{{ complementary_information.issue_location }}, {% endif %}{{ issue_date_long }}</w:t>
       </w:r>
     </w:p>
     <w:p>
       <w:r>
+        <w:rPr>
+          <w:rFonts w:ascii="Arial" w:hAnsi="Arial"/>
+        </w:rPr>
         <w:t>{%p endif %}</w:t>
       </w:r>
     </w:p>
     <w:p>
       <w:pPr>
         <w:pStyle w:val="Heading1"/>
+        <w:keepNext/>
+        <w:pageBreakBefore w:val="0"/>
       </w:pPr>
       <w:r>
+        <w:rPr>
+          <w:rFonts w:ascii="Arial" w:hAnsi="Arial"/>
+        </w:rPr>
         <w:t>7. ASSINATURAS</w:t>
       </w:r>
     </w:p>
-    <w:p>
-      <w:pPr>
-        <w:pStyle w:val="Heading2"/>
-      </w:pPr>
-      <w:r>
-        <w:t>LOCADOR</w:t>
-      </w:r>
-    </w:p>
-    <w:p>
-      <w:r>
-        <w:t>____________________________________</w:t>
-      </w:r>
-    </w:p>
-    <w:p>
-      <w:r>
-        <w:t>{{ landlord.name }}</w:t>
-      </w:r>
-    </w:p>
-    <w:p>
-      <w:pPr>
-        <w:pStyle w:val="Heading2"/>
-      </w:pPr>
-      <w:r>
-        <w:t>LOCATÁRIO</w:t>
-      </w:r>
-    </w:p>
-    <w:p>
-      <w:r>
-        <w:t>____________________________________</w:t>
-      </w:r>
-    </w:p>
-    <w:p>
-      <w:r>
-        <w:t>{{ tenant.name }}</w:t>
-      </w:r>
-    </w:p>
+    <w:tbl>
+      <w:tblPr>
+        <w:tblW w:type="auto" w:w="0"/>
+        <w:tblLayout w:type="fixed"/>
+        <w:tblLook w:firstColumn="1" w:firstRow="1" w:lastColumn="0" w:lastRow="0" w:noHBand="0" w:noVBand="1" w:val="04A0"/>
+        <w:tblBorders>
+          <w:top w:val="nil"/>
+          <w:left w:val="nil"/>
+          <w:bottom w:val="nil"/>
+          <w:right w:val="nil"/>
+          <w:insideH w:val="nil"/>
+          <w:insideV w:val="nil"/>
+        </w:tblBorders>
+      </w:tblPr>
+      <w:tblGrid>
+        <w:gridCol w:w="4677"/>
+        <w:gridCol w:w="4677"/>
+      </w:tblGrid>
+      <w:tr>
+        <w:trPr>
+          <w:cantSplit/>
+        </w:trPr>
+        <w:tc>
+          <w:tcPr>
+            <w:tcW w:type="dxa" w:w="4677"/>
+          </w:tcPr>
+          <w:p>
+            <w:pPr>
+              <w:pStyle w:val="Heading2"/>
+              <w:jc w:val="center"/>
+            </w:pPr>
+            <w:r>
+              <w:t>LOCADOR</w:t>
+            </w:r>
+          </w:p>
+          <w:p>
+            <w:pPr>
+              <w:keepNext/>
+              <w:spacing w:before="600" w:after="80"/>
+              <w:jc w:val="center"/>
+            </w:pPr>
+            <w:r>
+              <w:t>____________________________________</w:t>
+            </w:r>
+          </w:p>
+          <w:p>
+            <w:pPr>
+              <w:jc w:val="center"/>
+            </w:pPr>
+            <w:r>
+              <w:t>{{ landlord.name }}</w:t>
+            </w:r>
+          </w:p>
+        </w:tc>
+        <w:tc>
+          <w:tcPr>
+            <w:tcW w:type="dxa" w:w="4677"/>
+          </w:tcPr>
+          <w:p>
+            <w:pPr>
+              <w:pStyle w:val="Heading2"/>
+              <w:jc w:val="center"/>
+            </w:pPr>
+            <w:r>
+              <w:t>LOCATÁRIO</w:t>
+            </w:r>
+          </w:p>
+          <w:p>
+            <w:pPr>
+              <w:keepNext/>
+              <w:spacing w:before="600" w:after="80"/>
+              <w:jc w:val="center"/>
+            </w:pPr>
+            <w:r>
+              <w:t>____________________________________</w:t>
+            </w:r>
+          </w:p>
+          <w:p>
+            <w:pPr>
+              <w:jc w:val="center"/>
+            </w:pPr>
+            <w:r>
+              <w:t>{{ tenant.name }}</w:t>
+            </w:r>
+          </w:p>
+        </w:tc>
+      </w:tr>
+    </w:tbl>
     <w:sectPr>
-      <w:pgSz w:w="12240" w:h="15840"/>
-      <w:pgMar w:top="1440" w:right="1800" w:bottom="1440" w:left="1800" w:header="720" w:footer="720" w:gutter="0"/>
+      <w:headerReference w:type="default" r:id="rId10"/>
+      <w:footerReference w:type="default" r:id="rId11"/>
+      <w:footerReference w:type="first" r:id="rId12"/>
+      <w:type w:val="nextPage"/>
+      <w:pgSz w:w="11906" w:h="16838"/>
+      <w:pgMar w:top="1417" w:right="1134" w:bottom="1134" w:left="1417" w:header="397" w:footer="510" w:gutter="0"/>
       <w:cols w:space="720"/>
+      <w:vAlign w:val="top"/>
       <w:docGrid w:linePitch="360"/>
     </w:sectPr>
   </w:body>
 </w:document>
+</file>
+
+<file path=word/footer1.xml><?xml version="1.0" encoding="utf-8"?>
+<w:ftr xmlns:m="http://schemas.openxmlformats.org/officeDocument/2006/math" xmlns:mc="http://schemas.openxmlformats.org/markup-compatibility/2006" xmlns:mo="http://schemas.microsoft.com/office/mac/office/2008/main" xmlns:mv="urn:schemas-microsoft-com:mac:vml" xmlns:o="urn:schemas-microsoft-com:office:office" xmlns:r="http://schemas.openxmlformats.org/officeDocument/2006/relationships" xmlns:v="urn:schemas-microsoft-com:vml" xmlns:w10="urn:schemas-microsoft-com:office:word" xmlns:w14="http://schemas.microsoft.com/office/word/2010/wordml" xmlns:w="http://schemas.openxmlformats.org/wordprocessingml/2006/main" xmlns:wne="http://schemas.microsoft.com/office/word/2006/wordml" xmlns:wp14="http://schemas.microsoft.com/office/word/2010/wordprocessingDrawing" xmlns:wp="http://schemas.openxmlformats.org/drawingml/2006/wordprocessingDrawing" xmlns:wpc="http://schemas.microsoft.com/office/word/2010/wordprocessingCanvas" xmlns:wpg="http://schemas.microsoft.com/office/word/2010/wordprocessingGroup" xmlns:wpi="http://schemas.microsoft.com/office/word/2010/wordprocessingInk" xmlns:wps="http://schemas.microsoft.com/office/word/2010/wordprocessingShape" mc:Ignorable="w14 wp14">
+  <w:p>
+    <w:pPr>
+      <w:pStyle w:val="Footer"/>
+      <w:jc w:val="right"/>
+    </w:pPr>
+    <w:r>
+      <w:rPr>
+        <w:rFonts w:ascii="Arial" w:hAnsi="Arial"/>
+        <w:color w:val="667788"/>
+        <w:sz w:val="16"/>
+      </w:rPr>
+      <w:t xml:space="preserve">Página </w:t>
+    </w:r>
+    <w:r>
+      <w:rPr>
+        <w:rFonts w:ascii="Arial" w:hAnsi="Arial"/>
+        <w:color w:val="667788"/>
+        <w:sz w:val="16"/>
+      </w:rPr>
+      <w:fldChar w:fldCharType="begin"/>
+      <w:instrText> PAGE </w:instrText>
+      <w:fldChar w:fldCharType="end"/>
+    </w:r>
+    <w:r>
+      <w:rPr>
+        <w:rFonts w:ascii="Arial" w:hAnsi="Arial"/>
+        <w:color w:val="667788"/>
+        <w:sz w:val="16"/>
+      </w:rPr>
+      <w:t xml:space="preserve"> de </w:t>
+    </w:r>
+    <w:r>
+      <w:rPr>
+        <w:rFonts w:ascii="Arial" w:hAnsi="Arial"/>
+        <w:color w:val="667788"/>
+        <w:sz w:val="16"/>
+      </w:rPr>
+      <w:fldChar w:fldCharType="begin"/>
+      <w:instrText> NUMPAGES </w:instrText>
+      <w:fldChar w:fldCharType="end"/>
+    </w:r>
+    <w:r>
+      <w:rPr>
+        <w:rFonts w:ascii="Arial" w:hAnsi="Arial"/>
+        <w:color w:val="667788"/>
+        <w:sz w:val="16"/>
+      </w:rPr>
+    </w:r>
+  </w:p>
+</w:ftr>
+</file>
+
+<file path=word/footer2.xml><?xml version="1.0" encoding="utf-8"?>
+<w:ftr xmlns:m="http://schemas.openxmlformats.org/officeDocument/2006/math" xmlns:mc="http://schemas.openxmlformats.org/markup-compatibility/2006" xmlns:mo="http://schemas.microsoft.com/office/mac/office/2008/main" xmlns:mv="urn:schemas-microsoft-com:mac:vml" xmlns:o="urn:schemas-microsoft-com:office:office" xmlns:r="http://schemas.openxmlformats.org/officeDocument/2006/relationships" xmlns:v="urn:schemas-microsoft-com:vml" xmlns:w10="urn:schemas-microsoft-com:office:word" xmlns:w14="http://schemas.microsoft.com/office/word/2010/wordml" xmlns:w="http://schemas.openxmlformats.org/wordprocessingml/2006/main" xmlns:wne="http://schemas.microsoft.com/office/word/2006/wordml" xmlns:wp14="http://schemas.microsoft.com/office/word/2010/wordprocessingDrawing" xmlns:wp="http://schemas.openxmlformats.org/drawingml/2006/wordprocessingDrawing" xmlns:wpc="http://schemas.microsoft.com/office/word/2010/wordprocessingCanvas" xmlns:wpg="http://schemas.microsoft.com/office/word/2010/wordprocessingGroup" xmlns:wpi="http://schemas.microsoft.com/office/word/2010/wordprocessingInk" xmlns:wps="http://schemas.microsoft.com/office/word/2010/wordprocessingShape" mc:Ignorable="w14 wp14">
+  <w:p>
+    <w:pPr>
+      <w:pStyle w:val="Footer"/>
+      <w:jc w:val="right"/>
+    </w:pPr>
+    <w:r>
+      <w:rPr>
+        <w:rFonts w:ascii="Arial" w:hAnsi="Arial"/>
+        <w:color w:val="667788"/>
+        <w:sz w:val="16"/>
+      </w:rPr>
+      <w:t xml:space="preserve">Página </w:t>
+    </w:r>
+    <w:r>
+      <w:rPr>
+        <w:rFonts w:ascii="Arial" w:hAnsi="Arial"/>
+        <w:color w:val="667788"/>
+        <w:sz w:val="16"/>
+      </w:rPr>
+      <w:fldChar w:fldCharType="begin"/>
+      <w:instrText> PAGE </w:instrText>
+      <w:fldChar w:fldCharType="end"/>
+    </w:r>
+    <w:r>
+      <w:rPr>
+        <w:rFonts w:ascii="Arial" w:hAnsi="Arial"/>
+        <w:color w:val="667788"/>
+        <w:sz w:val="16"/>
+      </w:rPr>
+      <w:t xml:space="preserve"> de </w:t>
+    </w:r>
+    <w:r>
+      <w:rPr>
+        <w:rFonts w:ascii="Arial" w:hAnsi="Arial"/>
+        <w:color w:val="667788"/>
+        <w:sz w:val="16"/>
+      </w:rPr>
+      <w:fldChar w:fldCharType="begin"/>
+      <w:instrText> NUMPAGES </w:instrText>
+      <w:fldChar w:fldCharType="end"/>
+    </w:r>
+    <w:r>
+      <w:rPr>
+        <w:rFonts w:ascii="Arial" w:hAnsi="Arial"/>
+        <w:color w:val="667788"/>
+        <w:sz w:val="16"/>
+      </w:rPr>
+    </w:r>
+  </w:p>
+</w:ftr>
+</file>
+
+<file path=word/header1.xml><?xml version="1.0" encoding="utf-8"?>
+<w:hdr xmlns:m="http://schemas.openxmlformats.org/officeDocument/2006/math" xmlns:mc="http://schemas.openxmlformats.org/markup-compatibility/2006" xmlns:mo="http://schemas.microsoft.com/office/mac/office/2008/main" xmlns:mv="urn:schemas-microsoft-com:mac:vml" xmlns:o="urn:schemas-microsoft-com:office:office" xmlns:r="http://schemas.openxmlformats.org/officeDocument/2006/relationships" xmlns:v="urn:schemas-microsoft-com:vml" xmlns:w10="urn:schemas-microsoft-com:office:word" xmlns:w14="http://schemas.microsoft.com/office/word/2010/wordml" xmlns:w="http://schemas.openxmlformats.org/wordprocessingml/2006/main" xmlns:wne="http://schemas.microsoft.com/office/word/2006/wordml" xmlns:wp14="http://schemas.microsoft.com/office/word/2010/wordprocessingDrawing" xmlns:wp="http://schemas.openxmlformats.org/drawingml/2006/wordprocessingDrawing" xmlns:wpc="http://schemas.microsoft.com/office/word/2010/wordprocessingCanvas" xmlns:wpg="http://schemas.microsoft.com/office/word/2010/wordprocessingGroup" xmlns:wpi="http://schemas.microsoft.com/office/word/2010/wordprocessingInk" xmlns:wps="http://schemas.microsoft.com/office/word/2010/wordprocessingShape" mc:Ignorable="w14 wp14">
+  <w:p>
+    <w:pPr>
+      <w:pStyle w:val="Header"/>
+      <w:spacing w:after="100"/>
+      <w:pBdr>
+        <w:bottom w:val="single" w:sz="4" w:color="B8CADB" w:space="5"/>
+      </w:pBdr>
+    </w:pPr>
+    <w:r>
+      <w:drawing>
+        <wp:inline xmlns:a="http://schemas.openxmlformats.org/drawingml/2006/main" xmlns:pic="http://schemas.openxmlformats.org/drawingml/2006/picture">
+          <wp:extent cx="396000" cy="264000"/>
+          <wp:docPr id="1" name="Picture 1"/>
+          <wp:cNvGraphicFramePr>
+            <a:graphicFrameLocks noChangeAspect="1"/>
+          </wp:cNvGraphicFramePr>
+          <a:graphic>
+            <a:graphicData uri="http://schemas.openxmlformats.org/drawingml/2006/picture">
+              <pic:pic>
+                <pic:nvPicPr>
+                  <pic:cNvPr id="0" name="logo_alger.png"/>
+                  <pic:cNvPicPr/>
+                </pic:nvPicPr>
+                <pic:blipFill>
+                  <a:blip r:embed="rId1"/>
+                  <a:stretch>
+                    <a:fillRect/>
+                  </a:stretch>
+                </pic:blipFill>
+                <pic:spPr>
+                  <a:xfrm>
+                    <a:off x="0" y="0"/>
+                    <a:ext cx="396000" cy="264000"/>
+                  </a:xfrm>
+                  <a:prstGeom prst="rect"/>
+                </pic:spPr>
+              </pic:pic>
+            </a:graphicData>
+          </a:graphic>
+        </wp:inline>
+      </w:drawing>
+    </w:r>
+    <w:r>
+      <w:rPr>
+        <w:b/>
+        <w:color w:val="123B70"/>
+        <w:sz w:val="18"/>
+      </w:rPr>
+      <w:t xml:space="preserve">   ALGER IMÓVEIS LTDA</w:t>
+    </w:r>
+    <w:r>
+      <w:rPr>
+        <w:sz w:val="18"/>
+      </w:rPr>
+      <w:t xml:space="preserve">   |   Relatório de Vistoria</w:t>
+    </w:r>
+  </w:p>
+</w:hdr>
 </file>
 
 <file path=word/numbering.xml><?xml version="1.0" encoding="utf-8"?>
@@ -1141,9 +2229,13 @@
     <w:name w:val="Normal"/>
     <w:qFormat/>
     <w:rsid w:val="00FC693F"/>
+    <w:pPr>
+      <w:widowControl/>
+      <w:spacing w:after="60" w:line="252" w:lineRule="auto"/>
+    </w:pPr>
     <w:rPr>
-      <w:rFonts w:ascii="Arial" w:hAnsi="Arial"/>
-      <w:sz w:val="22"/>
+      <w:rFonts w:ascii="Arial" w:hAnsi="Arial" w:eastAsia="Arial" w:cs="Arial"/>
+      <w:sz w:val="20"/>
     </w:rPr>
   </w:style>
   <w:style w:type="paragraph" w:styleId="Header">
@@ -1160,6 +2252,9 @@
       </w:tabs>
       <w:spacing w:after="0" w:line="240" w:lineRule="auto"/>
     </w:pPr>
+    <w:rPr>
+      <w:rFonts w:ascii="Arial" w:hAnsi="Arial" w:eastAsia="Arial" w:cs="Arial"/>
+    </w:rPr>
   </w:style>
   <w:style w:type="character" w:customStyle="1" w:styleId="HeaderChar">
     <w:name w:val="Header Char"/>
@@ -1167,6 +2262,9 @@
     <w:link w:val="Header"/>
     <w:uiPriority w:val="99"/>
     <w:rsid w:val="00E618BF"/>
+    <w:rPr>
+      <w:rFonts w:ascii="Arial" w:hAnsi="Arial" w:eastAsia="Arial" w:cs="Arial"/>
+    </w:rPr>
   </w:style>
   <w:style w:type="paragraph" w:styleId="Footer">
     <w:name w:val="footer"/>
@@ -1182,6 +2280,9 @@
       </w:tabs>
       <w:spacing w:after="0" w:line="240" w:lineRule="auto"/>
     </w:pPr>
+    <w:rPr>
+      <w:rFonts w:ascii="Arial" w:hAnsi="Arial" w:eastAsia="Arial" w:cs="Arial"/>
+    </w:rPr>
   </w:style>
   <w:style w:type="character" w:customStyle="1" w:styleId="FooterChar">
     <w:name w:val="Footer Char"/>
@@ -1189,6 +2290,9 @@
     <w:link w:val="Footer"/>
     <w:uiPriority w:val="99"/>
     <w:rsid w:val="00E618BF"/>
+    <w:rPr>
+      <w:rFonts w:ascii="Arial" w:hAnsi="Arial" w:eastAsia="Arial" w:cs="Arial"/>
+    </w:rPr>
   </w:style>
   <w:style w:type="paragraph" w:styleId="Heading1">
     <w:name w:val="heading 1"/>
@@ -1201,15 +2305,15 @@
     <w:pPr>
       <w:keepNext/>
       <w:keepLines/>
-      <w:spacing w:before="480" w:after="0"/>
+      <w:spacing w:before="360" w:after="140"/>
       <w:outlineLvl w:val="0"/>
     </w:pPr>
     <w:rPr>
-      <w:rFonts w:asciiTheme="majorHAnsi" w:eastAsiaTheme="majorEastAsia" w:hAnsiTheme="majorHAnsi" w:cstheme="majorBidi"/>
+      <w:rFonts w:cstheme="majorBidi" w:ascii="Arial" w:hAnsi="Arial" w:eastAsia="Arial" w:cs="Arial"/>
       <w:b/>
       <w:bCs/>
-      <w:color w:val="365F91" w:themeColor="accent1" w:themeShade="BF"/>
-      <w:sz w:val="28"/>
+      <w:color w:val="123B70"/>
+      <w:sz w:val="30"/>
       <w:szCs w:val="28"/>
     </w:rPr>
   </w:style>
@@ -1225,15 +2329,15 @@
     <w:pPr>
       <w:keepNext/>
       <w:keepLines/>
-      <w:spacing w:before="200" w:after="0"/>
+      <w:spacing w:before="220" w:after="100"/>
       <w:outlineLvl w:val="1"/>
     </w:pPr>
     <w:rPr>
-      <w:rFonts w:asciiTheme="majorHAnsi" w:eastAsiaTheme="majorEastAsia" w:hAnsiTheme="majorHAnsi" w:cstheme="majorBidi"/>
+      <w:rFonts w:cstheme="majorBidi" w:ascii="Arial" w:hAnsi="Arial" w:eastAsia="Arial" w:cs="Arial"/>
       <w:b/>
       <w:bCs/>
-      <w:color w:val="4F81BD" w:themeColor="accent1"/>
-      <w:sz w:val="26"/>
+      <w:color w:val="123B70"/>
+      <w:sz w:val="24"/>
       <w:szCs w:val="26"/>
     </w:rPr>
   </w:style>
@@ -1249,14 +2353,15 @@
     <w:pPr>
       <w:keepNext/>
       <w:keepLines/>
-      <w:spacing w:before="200" w:after="0"/>
+      <w:spacing w:before="140" w:after="80"/>
       <w:outlineLvl w:val="2"/>
     </w:pPr>
     <w:rPr>
-      <w:rFonts w:asciiTheme="majorHAnsi" w:eastAsiaTheme="majorEastAsia" w:hAnsiTheme="majorHAnsi" w:cstheme="majorBidi"/>
+      <w:rFonts w:cstheme="majorBidi" w:ascii="Arial" w:hAnsi="Arial" w:eastAsia="Arial" w:cs="Arial"/>
       <w:b/>
       <w:bCs/>
-      <w:color w:val="4F81BD" w:themeColor="accent1"/>
+      <w:color w:val="123B70"/>
+      <w:sz w:val="20"/>
     </w:rPr>
   </w:style>
   <w:style w:type="paragraph" w:styleId="Heading4">
@@ -1276,7 +2381,7 @@
       <w:outlineLvl w:val="3"/>
     </w:pPr>
     <w:rPr>
-      <w:rFonts w:asciiTheme="majorHAnsi" w:eastAsiaTheme="majorEastAsia" w:hAnsiTheme="majorHAnsi" w:cstheme="majorBidi"/>
+      <w:rFonts w:cstheme="majorBidi" w:ascii="Arial" w:hAnsi="Arial" w:eastAsia="Arial" w:cs="Arial"/>
       <w:b/>
       <w:bCs/>
       <w:i/>
@@ -1301,7 +2406,7 @@
       <w:outlineLvl w:val="4"/>
     </w:pPr>
     <w:rPr>
-      <w:rFonts w:asciiTheme="majorHAnsi" w:eastAsiaTheme="majorEastAsia" w:hAnsiTheme="majorHAnsi" w:cstheme="majorBidi"/>
+      <w:rFonts w:cstheme="majorBidi" w:ascii="Arial" w:hAnsi="Arial" w:eastAsia="Arial" w:cs="Arial"/>
       <w:color w:val="243F60" w:themeColor="accent1" w:themeShade="7F"/>
     </w:rPr>
   </w:style>
@@ -1322,7 +2427,7 @@
       <w:outlineLvl w:val="5"/>
     </w:pPr>
     <w:rPr>
-      <w:rFonts w:asciiTheme="majorHAnsi" w:eastAsiaTheme="majorEastAsia" w:hAnsiTheme="majorHAnsi" w:cstheme="majorBidi"/>
+      <w:rFonts w:cstheme="majorBidi" w:ascii="Arial" w:hAnsi="Arial" w:eastAsia="Arial" w:cs="Arial"/>
       <w:i/>
       <w:iCs/>
       <w:color w:val="243F60" w:themeColor="accent1" w:themeShade="7F"/>
@@ -1345,7 +2450,7 @@
       <w:outlineLvl w:val="6"/>
     </w:pPr>
     <w:rPr>
-      <w:rFonts w:asciiTheme="majorHAnsi" w:eastAsiaTheme="majorEastAsia" w:hAnsiTheme="majorHAnsi" w:cstheme="majorBidi"/>
+      <w:rFonts w:cstheme="majorBidi" w:ascii="Arial" w:hAnsi="Arial" w:eastAsia="Arial" w:cs="Arial"/>
       <w:i/>
       <w:iCs/>
       <w:color w:val="404040" w:themeColor="text1" w:themeTint="BF"/>
@@ -1368,7 +2473,7 @@
       <w:outlineLvl w:val="7"/>
     </w:pPr>
     <w:rPr>
-      <w:rFonts w:asciiTheme="majorHAnsi" w:eastAsiaTheme="majorEastAsia" w:hAnsiTheme="majorHAnsi" w:cstheme="majorBidi"/>
+      <w:rFonts w:cstheme="majorBidi" w:ascii="Arial" w:hAnsi="Arial" w:eastAsia="Arial" w:cs="Arial"/>
       <w:color w:val="4F81BD" w:themeColor="accent1"/>
       <w:sz w:val="20"/>
       <w:szCs w:val="20"/>
@@ -1391,7 +2496,7 @@
       <w:outlineLvl w:val="8"/>
     </w:pPr>
     <w:rPr>
-      <w:rFonts w:asciiTheme="majorHAnsi" w:eastAsiaTheme="majorEastAsia" w:hAnsiTheme="majorHAnsi" w:cstheme="majorBidi"/>
+      <w:rFonts w:cstheme="majorBidi" w:ascii="Arial" w:hAnsi="Arial" w:eastAsia="Arial" w:cs="Arial"/>
       <w:i/>
       <w:iCs/>
       <w:color w:val="404040" w:themeColor="text1" w:themeTint="BF"/>
@@ -1404,6 +2509,9 @@
     <w:uiPriority w:val="1"/>
     <w:semiHidden/>
     <w:unhideWhenUsed/>
+    <w:rPr>
+      <w:rFonts w:ascii="Arial" w:hAnsi="Arial" w:eastAsia="Arial" w:cs="Arial"/>
+    </w:rPr>
   </w:style>
   <w:style w:type="table" w:default="1" w:styleId="TableNormal">
     <w:name w:val="Normal Table"/>
@@ -1434,6 +2542,9 @@
     <w:pPr>
       <w:spacing w:after="0" w:line="240" w:lineRule="auto"/>
     </w:pPr>
+    <w:rPr>
+      <w:rFonts w:ascii="Arial" w:hAnsi="Arial" w:eastAsia="Arial" w:cs="Arial"/>
+    </w:rPr>
   </w:style>
   <w:style w:type="character" w:customStyle="1" w:styleId="Heading1Char">
     <w:name w:val="Heading 1 Char"/>
@@ -1442,7 +2553,7 @@
     <w:uiPriority w:val="9"/>
     <w:rsid w:val="00FC693F"/>
     <w:rPr>
-      <w:rFonts w:asciiTheme="majorHAnsi" w:eastAsiaTheme="majorEastAsia" w:hAnsiTheme="majorHAnsi" w:cstheme="majorBidi"/>
+      <w:rFonts w:cstheme="majorBidi" w:ascii="Arial" w:hAnsi="Arial" w:eastAsia="Arial" w:cs="Arial"/>
       <w:b/>
       <w:bCs/>
       <w:color w:val="365F91" w:themeColor="accent1" w:themeShade="BF"/>
@@ -1457,7 +2568,7 @@
     <w:uiPriority w:val="9"/>
     <w:rsid w:val="00FC693F"/>
     <w:rPr>
-      <w:rFonts w:asciiTheme="majorHAnsi" w:eastAsiaTheme="majorEastAsia" w:hAnsiTheme="majorHAnsi" w:cstheme="majorBidi"/>
+      <w:rFonts w:cstheme="majorBidi" w:ascii="Arial" w:hAnsi="Arial" w:eastAsia="Arial" w:cs="Arial"/>
       <w:b/>
       <w:bCs/>
       <w:color w:val="4F81BD" w:themeColor="accent1"/>
@@ -1472,7 +2583,7 @@
     <w:uiPriority w:val="9"/>
     <w:rsid w:val="00FC693F"/>
     <w:rPr>
-      <w:rFonts w:asciiTheme="majorHAnsi" w:eastAsiaTheme="majorEastAsia" w:hAnsiTheme="majorHAnsi" w:cstheme="majorBidi"/>
+      <w:rFonts w:cstheme="majorBidi" w:ascii="Arial" w:hAnsi="Arial" w:eastAsia="Arial" w:cs="Arial"/>
       <w:b/>
       <w:bCs/>
       <w:color w:val="4F81BD" w:themeColor="accent1"/>
@@ -1487,18 +2598,21 @@
     <w:qFormat/>
     <w:rsid w:val="00FC693F"/>
     <w:pPr>
+      <w:keepNext/>
+      <w:keepLines/>
       <w:pBdr>
         <w:bottom w:val="single" w:sz="8" w:space="4" w:color="4F81BD" w:themeColor="accent1"/>
       </w:pBdr>
-      <w:spacing w:after="300" w:line="240" w:lineRule="auto"/>
+      <w:spacing w:after="240" w:line="240" w:lineRule="auto" w:before="320"/>
       <w:contextualSpacing/>
     </w:pPr>
     <w:rPr>
-      <w:rFonts w:asciiTheme="majorHAnsi" w:eastAsiaTheme="majorEastAsia" w:hAnsiTheme="majorHAnsi" w:cstheme="majorBidi"/>
-      <w:color w:val="17365D" w:themeColor="text2" w:themeShade="BF"/>
+      <w:rFonts w:cstheme="majorBidi" w:ascii="Arial" w:hAnsi="Arial" w:eastAsia="Arial" w:cs="Arial"/>
+      <w:b/>
+      <w:color w:val="123B70"/>
       <w:spacing w:val="5"/>
       <w:kern w:val="28"/>
-      <w:sz w:val="52"/>
+      <w:sz w:val="50"/>
       <w:szCs w:val="52"/>
     </w:rPr>
   </w:style>
@@ -1509,7 +2623,7 @@
     <w:uiPriority w:val="10"/>
     <w:rsid w:val="00FC693F"/>
     <w:rPr>
-      <w:rFonts w:asciiTheme="majorHAnsi" w:eastAsiaTheme="majorEastAsia" w:hAnsiTheme="majorHAnsi" w:cstheme="majorBidi"/>
+      <w:rFonts w:cstheme="majorBidi" w:ascii="Arial" w:hAnsi="Arial" w:eastAsia="Arial" w:cs="Arial"/>
       <w:color w:val="17365D" w:themeColor="text2" w:themeShade="BF"/>
       <w:spacing w:val="5"/>
       <w:kern w:val="28"/>
@@ -1531,7 +2645,7 @@
       </w:numPr>
     </w:pPr>
     <w:rPr>
-      <w:rFonts w:asciiTheme="majorHAnsi" w:eastAsiaTheme="majorEastAsia" w:hAnsiTheme="majorHAnsi" w:cstheme="majorBidi"/>
+      <w:rFonts w:cstheme="majorBidi" w:ascii="Arial" w:hAnsi="Arial" w:eastAsia="Arial" w:cs="Arial"/>
       <w:i/>
       <w:iCs/>
       <w:color w:val="4F81BD" w:themeColor="accent1"/>
@@ -1547,7 +2661,7 @@
     <w:uiPriority w:val="11"/>
     <w:rsid w:val="00FC693F"/>
     <w:rPr>
-      <w:rFonts w:asciiTheme="majorHAnsi" w:eastAsiaTheme="majorEastAsia" w:hAnsiTheme="majorHAnsi" w:cstheme="majorBidi"/>
+      <w:rFonts w:cstheme="majorBidi" w:ascii="Arial" w:hAnsi="Arial" w:eastAsia="Arial" w:cs="Arial"/>
       <w:i/>
       <w:iCs/>
       <w:color w:val="4F81BD" w:themeColor="accent1"/>
@@ -1566,6 +2680,9 @@
       <w:ind w:left="720"/>
       <w:contextualSpacing/>
     </w:pPr>
+    <w:rPr>
+      <w:rFonts w:ascii="Arial" w:hAnsi="Arial" w:eastAsia="Arial" w:cs="Arial"/>
+    </w:rPr>
   </w:style>
   <w:style w:type="paragraph" w:styleId="BodyText">
     <w:name w:val="Body Text"/>
@@ -1577,6 +2694,9 @@
     <w:pPr>
       <w:spacing w:after="120"/>
     </w:pPr>
+    <w:rPr>
+      <w:rFonts w:ascii="Arial" w:hAnsi="Arial" w:eastAsia="Arial" w:cs="Arial"/>
+    </w:rPr>
   </w:style>
   <w:style w:type="character" w:customStyle="1" w:styleId="BodyTextChar">
     <w:name w:val="Body Text Char"/>
@@ -1584,6 +2704,9 @@
     <w:link w:val="BodyText"/>
     <w:uiPriority w:val="99"/>
     <w:rsid w:val="00AA1D8D"/>
+    <w:rPr>
+      <w:rFonts w:ascii="Arial" w:hAnsi="Arial" w:eastAsia="Arial" w:cs="Arial"/>
+    </w:rPr>
   </w:style>
   <w:style w:type="paragraph" w:styleId="BodyText2">
     <w:name w:val="Body Text 2"/>
@@ -1595,6 +2718,9 @@
     <w:pPr>
       <w:spacing w:after="120" w:line="480" w:lineRule="auto"/>
     </w:pPr>
+    <w:rPr>
+      <w:rFonts w:ascii="Arial" w:hAnsi="Arial" w:eastAsia="Arial" w:cs="Arial"/>
+    </w:rPr>
   </w:style>
   <w:style w:type="character" w:customStyle="1" w:styleId="BodyText2Char">
     <w:name w:val="Body Text 2 Char"/>
@@ -1602,6 +2728,9 @@
     <w:link w:val="BodyText2"/>
     <w:uiPriority w:val="99"/>
     <w:rsid w:val="00AA1D8D"/>
+    <w:rPr>
+      <w:rFonts w:ascii="Arial" w:hAnsi="Arial" w:eastAsia="Arial" w:cs="Arial"/>
+    </w:rPr>
   </w:style>
   <w:style w:type="paragraph" w:styleId="BodyText3">
     <w:name w:val="Body Text 3"/>
@@ -1614,6 +2743,7 @@
       <w:spacing w:after="120"/>
     </w:pPr>
     <w:rPr>
+      <w:rFonts w:ascii="Arial" w:hAnsi="Arial" w:eastAsia="Arial" w:cs="Arial"/>
       <w:sz w:val="16"/>
       <w:szCs w:val="16"/>
     </w:rPr>
@@ -1625,6 +2755,7 @@
     <w:uiPriority w:val="99"/>
     <w:rsid w:val="00AA1D8D"/>
     <w:rPr>
+      <w:rFonts w:ascii="Arial" w:hAnsi="Arial" w:eastAsia="Arial" w:cs="Arial"/>
       <w:sz w:val="16"/>
       <w:szCs w:val="16"/>
     </w:rPr>
@@ -1639,6 +2770,9 @@
       <w:ind w:left="360" w:hanging="360"/>
       <w:contextualSpacing/>
     </w:pPr>
+    <w:rPr>
+      <w:rFonts w:ascii="Arial" w:hAnsi="Arial" w:eastAsia="Arial" w:cs="Arial"/>
+    </w:rPr>
   </w:style>
   <w:style w:type="paragraph" w:styleId="List2">
     <w:name w:val="List 2"/>
@@ -1650,6 +2784,9 @@
       <w:ind w:left="720" w:hanging="360"/>
       <w:contextualSpacing/>
     </w:pPr>
+    <w:rPr>
+      <w:rFonts w:ascii="Arial" w:hAnsi="Arial" w:eastAsia="Arial" w:cs="Arial"/>
+    </w:rPr>
   </w:style>
   <w:style w:type="paragraph" w:styleId="List3">
     <w:name w:val="List 3"/>
@@ -1661,6 +2798,9 @@
       <w:ind w:left="1080" w:hanging="360"/>
       <w:contextualSpacing/>
     </w:pPr>
+    <w:rPr>
+      <w:rFonts w:ascii="Arial" w:hAnsi="Arial" w:eastAsia="Arial" w:cs="Arial"/>
+    </w:rPr>
   </w:style>
   <w:style w:type="paragraph" w:styleId="ListBullet">
     <w:name w:val="List Bullet"/>
@@ -1674,6 +2814,9 @@
       </w:numPr>
       <w:contextualSpacing/>
     </w:pPr>
+    <w:rPr>
+      <w:rFonts w:ascii="Arial" w:hAnsi="Arial" w:eastAsia="Arial" w:cs="Arial"/>
+    </w:rPr>
   </w:style>
   <w:style w:type="paragraph" w:styleId="ListBullet2">
     <w:name w:val="List Bullet 2"/>
@@ -1687,6 +2830,9 @@
       </w:numPr>
       <w:contextualSpacing/>
     </w:pPr>
+    <w:rPr>
+      <w:rFonts w:ascii="Arial" w:hAnsi="Arial" w:eastAsia="Arial" w:cs="Arial"/>
+    </w:rPr>
   </w:style>
   <w:style w:type="paragraph" w:styleId="ListBullet3">
     <w:name w:val="List Bullet 3"/>
@@ -1700,6 +2846,9 @@
       </w:numPr>
       <w:contextualSpacing/>
     </w:pPr>
+    <w:rPr>
+      <w:rFonts w:ascii="Arial" w:hAnsi="Arial" w:eastAsia="Arial" w:cs="Arial"/>
+    </w:rPr>
   </w:style>
   <w:style w:type="paragraph" w:styleId="ListNumber">
     <w:name w:val="List Number"/>
@@ -1713,6 +2862,9 @@
       </w:numPr>
       <w:contextualSpacing/>
     </w:pPr>
+    <w:rPr>
+      <w:rFonts w:ascii="Arial" w:hAnsi="Arial" w:eastAsia="Arial" w:cs="Arial"/>
+    </w:rPr>
   </w:style>
   <w:style w:type="paragraph" w:styleId="ListNumber2">
     <w:name w:val="List Number 2"/>
@@ -1726,6 +2878,9 @@
       </w:numPr>
       <w:contextualSpacing/>
     </w:pPr>
+    <w:rPr>
+      <w:rFonts w:ascii="Arial" w:hAnsi="Arial" w:eastAsia="Arial" w:cs="Arial"/>
+    </w:rPr>
   </w:style>
   <w:style w:type="paragraph" w:styleId="ListNumber3">
     <w:name w:val="List Number 3"/>
@@ -1739,6 +2894,9 @@
       </w:numPr>
       <w:contextualSpacing/>
     </w:pPr>
+    <w:rPr>
+      <w:rFonts w:ascii="Arial" w:hAnsi="Arial" w:eastAsia="Arial" w:cs="Arial"/>
+    </w:rPr>
   </w:style>
   <w:style w:type="paragraph" w:styleId="ListContinue">
     <w:name w:val="List Continue"/>
@@ -1751,6 +2909,9 @@
       <w:ind w:left="360"/>
       <w:contextualSpacing/>
     </w:pPr>
+    <w:rPr>
+      <w:rFonts w:ascii="Arial" w:hAnsi="Arial" w:eastAsia="Arial" w:cs="Arial"/>
+    </w:rPr>
   </w:style>
   <w:style w:type="paragraph" w:styleId="ListContinue2">
     <w:name w:val="List Continue 2"/>
@@ -1763,6 +2924,9 @@
       <w:ind w:left="720"/>
       <w:contextualSpacing/>
     </w:pPr>
+    <w:rPr>
+      <w:rFonts w:ascii="Arial" w:hAnsi="Arial" w:eastAsia="Arial" w:cs="Arial"/>
+    </w:rPr>
   </w:style>
   <w:style w:type="paragraph" w:styleId="ListContinue3">
     <w:name w:val="List Continue 3"/>
@@ -1775,6 +2939,9 @@
       <w:ind w:left="1080"/>
       <w:contextualSpacing/>
     </w:pPr>
+    <w:rPr>
+      <w:rFonts w:ascii="Arial" w:hAnsi="Arial" w:eastAsia="Arial" w:cs="Arial"/>
+    </w:rPr>
   </w:style>
   <w:style w:type="paragraph" w:styleId="MacroText">
     <w:name w:val="macro"/>
@@ -1794,7 +2961,7 @@
       </w:tabs>
     </w:pPr>
     <w:rPr>
-      <w:rFonts w:ascii="Courier" w:hAnsi="Courier"/>
+      <w:rFonts w:ascii="Arial" w:hAnsi="Arial" w:eastAsia="Arial" w:cs="Arial"/>
       <w:sz w:val="20"/>
       <w:szCs w:val="20"/>
     </w:rPr>
@@ -1806,7 +2973,7 @@
     <w:uiPriority w:val="99"/>
     <w:rsid w:val="0029639D"/>
     <w:rPr>
-      <w:rFonts w:ascii="Courier" w:hAnsi="Courier"/>
+      <w:rFonts w:ascii="Arial" w:hAnsi="Arial" w:eastAsia="Arial" w:cs="Arial"/>
       <w:sz w:val="20"/>
       <w:szCs w:val="20"/>
     </w:rPr>
@@ -1820,6 +2987,7 @@
     <w:qFormat/>
     <w:rsid w:val="00FC693F"/>
     <w:rPr>
+      <w:rFonts w:ascii="Arial" w:hAnsi="Arial" w:eastAsia="Arial" w:cs="Arial"/>
       <w:i/>
       <w:iCs/>
       <w:color w:val="000000" w:themeColor="text1"/>
@@ -1832,6 +3000,7 @@
     <w:uiPriority w:val="29"/>
     <w:rsid w:val="00FC693F"/>
     <w:rPr>
+      <w:rFonts w:ascii="Arial" w:hAnsi="Arial" w:eastAsia="Arial" w:cs="Arial"/>
       <w:i/>
       <w:iCs/>
       <w:color w:val="000000" w:themeColor="text1"/>
@@ -1845,7 +3014,7 @@
     <w:semiHidden/>
     <w:rsid w:val="00FC693F"/>
     <w:rPr>
-      <w:rFonts w:asciiTheme="majorHAnsi" w:eastAsiaTheme="majorEastAsia" w:hAnsiTheme="majorHAnsi" w:cstheme="majorBidi"/>
+      <w:rFonts w:cstheme="majorBidi" w:ascii="Arial" w:hAnsi="Arial" w:eastAsia="Arial" w:cs="Arial"/>
       <w:b/>
       <w:bCs/>
       <w:i/>
@@ -1861,7 +3030,7 @@
     <w:semiHidden/>
     <w:rsid w:val="00FC693F"/>
     <w:rPr>
-      <w:rFonts w:asciiTheme="majorHAnsi" w:eastAsiaTheme="majorEastAsia" w:hAnsiTheme="majorHAnsi" w:cstheme="majorBidi"/>
+      <w:rFonts w:cstheme="majorBidi" w:ascii="Arial" w:hAnsi="Arial" w:eastAsia="Arial" w:cs="Arial"/>
       <w:color w:val="243F60" w:themeColor="accent1" w:themeShade="7F"/>
     </w:rPr>
   </w:style>
@@ -1873,7 +3042,7 @@
     <w:semiHidden/>
     <w:rsid w:val="00FC693F"/>
     <w:rPr>
-      <w:rFonts w:asciiTheme="majorHAnsi" w:eastAsiaTheme="majorEastAsia" w:hAnsiTheme="majorHAnsi" w:cstheme="majorBidi"/>
+      <w:rFonts w:cstheme="majorBidi" w:ascii="Arial" w:hAnsi="Arial" w:eastAsia="Arial" w:cs="Arial"/>
       <w:i/>
       <w:iCs/>
       <w:color w:val="243F60" w:themeColor="accent1" w:themeShade="7F"/>
@@ -1887,7 +3056,7 @@
     <w:semiHidden/>
     <w:rsid w:val="00FC693F"/>
     <w:rPr>
-      <w:rFonts w:asciiTheme="majorHAnsi" w:eastAsiaTheme="majorEastAsia" w:hAnsiTheme="majorHAnsi" w:cstheme="majorBidi"/>
+      <w:rFonts w:cstheme="majorBidi" w:ascii="Arial" w:hAnsi="Arial" w:eastAsia="Arial" w:cs="Arial"/>
       <w:i/>
       <w:iCs/>
       <w:color w:val="404040" w:themeColor="text1" w:themeTint="BF"/>
@@ -1901,7 +3070,7 @@
     <w:semiHidden/>
     <w:rsid w:val="00FC693F"/>
     <w:rPr>
-      <w:rFonts w:asciiTheme="majorHAnsi" w:eastAsiaTheme="majorEastAsia" w:hAnsiTheme="majorHAnsi" w:cstheme="majorBidi"/>
+      <w:rFonts w:cstheme="majorBidi" w:ascii="Arial" w:hAnsi="Arial" w:eastAsia="Arial" w:cs="Arial"/>
       <w:color w:val="4F81BD" w:themeColor="accent1"/>
       <w:sz w:val="20"/>
       <w:szCs w:val="20"/>
@@ -1915,7 +3084,7 @@
     <w:semiHidden/>
     <w:rsid w:val="00FC693F"/>
     <w:rPr>
-      <w:rFonts w:asciiTheme="majorHAnsi" w:eastAsiaTheme="majorEastAsia" w:hAnsiTheme="majorHAnsi" w:cstheme="majorBidi"/>
+      <w:rFonts w:cstheme="majorBidi" w:ascii="Arial" w:hAnsi="Arial" w:eastAsia="Arial" w:cs="Arial"/>
       <w:i/>
       <w:iCs/>
       <w:color w:val="404040" w:themeColor="text1" w:themeTint="BF"/>
@@ -1936,8 +3105,10 @@
       <w:spacing w:line="240" w:lineRule="auto"/>
     </w:pPr>
     <w:rPr>
+      <w:rFonts w:ascii="Arial" w:hAnsi="Arial" w:eastAsia="Arial" w:cs="Arial"/>
       <w:b/>
       <w:bCs/>
+      <w:i w:val="0"/>
       <w:color w:val="4F81BD" w:themeColor="accent1"/>
       <w:sz w:val="18"/>
       <w:szCs w:val="18"/>
@@ -1950,6 +3121,7 @@
     <w:qFormat/>
     <w:rsid w:val="00FC693F"/>
     <w:rPr>
+      <w:rFonts w:ascii="Arial" w:hAnsi="Arial" w:eastAsia="Arial" w:cs="Arial"/>
       <w:b/>
       <w:bCs/>
     </w:rPr>
@@ -1961,6 +3133,7 @@
     <w:qFormat/>
     <w:rsid w:val="00FC693F"/>
     <w:rPr>
+      <w:rFonts w:ascii="Arial" w:hAnsi="Arial" w:eastAsia="Arial" w:cs="Arial"/>
       <w:i/>
       <w:iCs/>
     </w:rPr>
@@ -1981,6 +3154,7 @@
       <w:ind w:left="936" w:right="936"/>
     </w:pPr>
     <w:rPr>
+      <w:rFonts w:ascii="Arial" w:hAnsi="Arial" w:eastAsia="Arial" w:cs="Arial"/>
       <w:b/>
       <w:bCs/>
       <w:i/>
@@ -1995,6 +3169,7 @@
     <w:uiPriority w:val="30"/>
     <w:rsid w:val="00FC693F"/>
     <w:rPr>
+      <w:rFonts w:ascii="Arial" w:hAnsi="Arial" w:eastAsia="Arial" w:cs="Arial"/>
       <w:b/>
       <w:bCs/>
       <w:i/>
@@ -2009,6 +3184,7 @@
     <w:qFormat/>
     <w:rsid w:val="00FC693F"/>
     <w:rPr>
+      <w:rFonts w:ascii="Arial" w:hAnsi="Arial" w:eastAsia="Arial" w:cs="Arial"/>
       <w:i/>
       <w:iCs/>
       <w:color w:val="808080" w:themeColor="text1" w:themeTint="7F"/>
@@ -2021,6 +3197,7 @@
     <w:qFormat/>
     <w:rsid w:val="00FC693F"/>
     <w:rPr>
+      <w:rFonts w:ascii="Arial" w:hAnsi="Arial" w:eastAsia="Arial" w:cs="Arial"/>
       <w:b/>
       <w:bCs/>
       <w:i/>
@@ -2035,6 +3212,7 @@
     <w:qFormat/>
     <w:rsid w:val="00FC693F"/>
     <w:rPr>
+      <w:rFonts w:ascii="Arial" w:hAnsi="Arial" w:eastAsia="Arial" w:cs="Arial"/>
       <w:smallCaps/>
       <w:color w:val="C0504D" w:themeColor="accent2"/>
       <w:u w:val="single"/>
@@ -2047,6 +3225,7 @@
     <w:qFormat/>
     <w:rsid w:val="00FC693F"/>
     <w:rPr>
+      <w:rFonts w:ascii="Arial" w:hAnsi="Arial" w:eastAsia="Arial" w:cs="Arial"/>
       <w:b/>
       <w:bCs/>
       <w:smallCaps/>
@@ -2062,6 +3241,7 @@
     <w:qFormat/>
     <w:rsid w:val="00FC693F"/>
     <w:rPr>
+      <w:rFonts w:ascii="Arial" w:hAnsi="Arial" w:eastAsia="Arial" w:cs="Arial"/>
       <w:b/>
       <w:bCs/>
       <w:smallCaps/>
@@ -2080,6 +3260,9 @@
     <w:pPr>
       <w:outlineLvl w:val="9"/>
     </w:pPr>
+    <w:rPr>
+      <w:rFonts w:ascii="Arial" w:hAnsi="Arial" w:eastAsia="Arial" w:cs="Arial"/>
+    </w:rPr>
   </w:style>
   <w:style w:type="table" w:styleId="TableGrid">
     <w:name w:val="Table Grid"/>

</xml_diff>